<commit_message>
Documentatie: prezentarea pentru Aeroportul Iasi include descrierea platformei si toate serviciile afiliate; varianta PDF
Co-Authored-By: Claude Opus 5.5 <noreply@anthropic.com>
Claude-Session: https://claude.ai/code/session_013DhLwtBxtjM2mqe9bSdjwk
</commit_message>
<xml_diff>
--- a/documentation/securitate-gazduire-aeroport-iasi.docx
+++ b/documentation/securitate-gazduire-aeroport-iasi.docx
@@ -41,7 +41,7 @@
           <w:sz w:val="44"/>
           <w:szCs w:val="44"/>
         </w:rPr>
-        <w:t xml:space="preserve">Securitatea și găzduirea platformei Alexandrit</w:t>
+        <w:t xml:space="preserve">Platforma Alexandrit: descriere, securitate și găzduire</w:t>
       </w:r>
     </w:p>
     <w:p>
@@ -56,7 +56,7 @@
           <w:sz w:val="26"/>
           <w:szCs w:val="26"/>
         </w:rPr>
-        <w:t xml:space="preserve">Infrastructura cloud actuală comparată cu un server intern securizat: avantaje, dezavantaje și recomandare</w:t>
+        <w:t xml:space="preserve">Prezentarea platformei și a serviciilor afiliate, nivelul de securitate și comparația cu un server intern</w:t>
       </w:r>
     </w:p>
     <w:p>
@@ -245,7 +245,30 @@
         <w:rPr>
           <w:rFonts w:ascii="Arial" w:cs="Arial" w:eastAsia="Arial" w:hAnsi="Arial"/>
         </w:rPr>
-        <w:t xml:space="preserve">2. Cum este construită platforma</w:t>
+        <w:t xml:space="preserve">2. Ce este platforma Alexandrit</w:t>
+      </w:r>
+    </w:p>
+    <w:p>
+      <w:pPr>
+        <w:spacing w:after="120" w:line="300"/>
+      </w:pPr>
+      <w:r>
+        <w:rPr>
+          <w:rFonts w:ascii="Arial" w:cs="Arial" w:eastAsia="Arial" w:hAnsi="Arial"/>
+        </w:rPr>
+        <w:t xml:space="preserve">Alexandrit este o platformă online (SaaS) pentru organizații neguvernamentale. Fiecare ONG își face cont și primește, pe bază de abonament lunar, un CRM complet și un set de instrumente de strângere de fonduri. Organizațiile sunt complet separate între ele: fiecare vede doar propriile date.</w:t>
+      </w:r>
+    </w:p>
+    <w:p>
+      <w:pPr>
+        <w:pStyle w:val="Heading2"/>
+        <w:spacing w:after="120" w:before="240"/>
+      </w:pPr>
+      <w:r>
+        <w:rPr>
+          <w:rFonts w:ascii="Arial" w:cs="Arial" w:eastAsia="Arial" w:hAnsi="Arial"/>
+        </w:rPr>
+        <w:t xml:space="preserve">Module principale</w:t>
       </w:r>
     </w:p>
     <w:tbl>
@@ -261,9 +284,8 @@
         </w:tblBorders>
       </w:tblPr>
       <w:tblGrid>
-        <w:gridCol w:w="2300"/>
-        <w:gridCol w:w="2200"/>
-        <w:gridCol w:w="5138"/>
+        <w:gridCol w:w="2700"/>
+        <w:gridCol w:w="6938"/>
       </w:tblGrid>
       <w:tr>
         <w:trPr>
@@ -271,7 +293,7 @@
         </w:trPr>
         <w:tc>
           <w:tcPr>
-            <w:tcW w:type="dxa" w:w="2300"/>
+            <w:tcW w:type="dxa" w:w="2700"/>
             <w:tcBorders>
               <w:top w:val="single" w:color="C9D3DE" w:sz="4"/>
               <w:left w:val="single" w:color="C9D3DE" w:sz="4"/>
@@ -296,13 +318,13 @@
                 <w:sz w:val="19"/>
                 <w:szCs w:val="19"/>
               </w:rPr>
-              <w:t xml:space="preserve">Componentă</w:t>
-            </w:r>
-          </w:p>
-        </w:tc>
-        <w:tc>
-          <w:tcPr>
-            <w:tcW w:type="dxa" w:w="2200"/>
+              <w:t xml:space="preserve">Modul</w:t>
+            </w:r>
+          </w:p>
+        </w:tc>
+        <w:tc>
+          <w:tcPr>
+            <w:tcW w:type="dxa" w:w="6938"/>
             <w:tcBorders>
               <w:top w:val="single" w:color="C9D3DE" w:sz="4"/>
               <w:left w:val="single" w:color="C9D3DE" w:sz="4"/>
@@ -327,13 +349,711 @@
                 <w:sz w:val="19"/>
                 <w:szCs w:val="19"/>
               </w:rPr>
-              <w:t xml:space="preserve">Furnizor</w:t>
-            </w:r>
-          </w:p>
-        </w:tc>
-        <w:tc>
-          <w:tcPr>
-            <w:tcW w:type="dxa" w:w="5138"/>
+              <w:t xml:space="preserve">Ce face</w:t>
+            </w:r>
+          </w:p>
+        </w:tc>
+      </w:tr>
+      <w:tr>
+        <w:tc>
+          <w:tcPr>
+            <w:tcW w:type="dxa" w:w="2700"/>
+            <w:tcBorders>
+              <w:top w:val="single" w:color="C9D3DE" w:sz="4"/>
+              <w:left w:val="single" w:color="C9D3DE" w:sz="4"/>
+              <w:bottom w:val="single" w:color="C9D3DE" w:sz="4"/>
+              <w:right w:val="single" w:color="C9D3DE" w:sz="4"/>
+            </w:tcBorders>
+            <w:shd w:fill="FFFFFF" w:color="auto" w:val="clear"/>
+            <w:tcMar>
+              <w:top w:type="dxa" w:w="80"/>
+              <w:left w:type="dxa" w:w="120"/>
+              <w:bottom w:type="dxa" w:w="80"/>
+              <w:right w:type="dxa" w:w="120"/>
+            </w:tcMar>
+          </w:tcPr>
+          <w:p>
+            <w:r>
+              <w:rPr>
+                <w:rFonts w:ascii="Arial" w:cs="Arial" w:eastAsia="Arial" w:hAnsi="Arial"/>
+                <w:b/>
+                <w:bCs/>
+                <w:color w:val="1A1A1A"/>
+                <w:sz w:val="19"/>
+                <w:szCs w:val="19"/>
+              </w:rPr>
+              <w:t xml:space="preserve">CRM donatori</w:t>
+            </w:r>
+          </w:p>
+        </w:tc>
+        <w:tc>
+          <w:tcPr>
+            <w:tcW w:type="dxa" w:w="6938"/>
+            <w:tcBorders>
+              <w:top w:val="single" w:color="C9D3DE" w:sz="4"/>
+              <w:left w:val="single" w:color="C9D3DE" w:sz="4"/>
+              <w:bottom w:val="single" w:color="C9D3DE" w:sz="4"/>
+              <w:right w:val="single" w:color="C9D3DE" w:sz="4"/>
+            </w:tcBorders>
+            <w:shd w:fill="FFFFFF" w:color="auto" w:val="clear"/>
+            <w:tcMar>
+              <w:top w:type="dxa" w:w="80"/>
+              <w:left w:type="dxa" w:w="120"/>
+              <w:bottom w:type="dxa" w:w="80"/>
+              <w:right w:type="dxa" w:w="120"/>
+            </w:tcMar>
+          </w:tcPr>
+          <w:p>
+            <w:r>
+              <w:rPr>
+                <w:rFonts w:ascii="Arial" w:cs="Arial" w:eastAsia="Arial" w:hAnsi="Arial"/>
+                <w:b w:val="false"/>
+                <w:bCs w:val="false"/>
+                <w:color w:val="1A1A1A"/>
+                <w:sz w:val="19"/>
+                <w:szCs w:val="19"/>
+              </w:rPr>
+              <w:t xml:space="preserve">Evidența persoanelor fizice și a donațiilor, istoric, segmentare RFM, comunicare și automatizări.</w:t>
+            </w:r>
+          </w:p>
+        </w:tc>
+      </w:tr>
+      <w:tr>
+        <w:tc>
+          <w:tcPr>
+            <w:tcW w:type="dxa" w:w="2700"/>
+            <w:tcBorders>
+              <w:top w:val="single" w:color="C9D3DE" w:sz="4"/>
+              <w:left w:val="single" w:color="C9D3DE" w:sz="4"/>
+              <w:bottom w:val="single" w:color="C9D3DE" w:sz="4"/>
+              <w:right w:val="single" w:color="C9D3DE" w:sz="4"/>
+            </w:tcBorders>
+            <w:shd w:fill="EEF3F8" w:color="auto" w:val="clear"/>
+            <w:tcMar>
+              <w:top w:type="dxa" w:w="80"/>
+              <w:left w:type="dxa" w:w="120"/>
+              <w:bottom w:type="dxa" w:w="80"/>
+              <w:right w:type="dxa" w:w="120"/>
+            </w:tcMar>
+          </w:tcPr>
+          <w:p>
+            <w:r>
+              <w:rPr>
+                <w:rFonts w:ascii="Arial" w:cs="Arial" w:eastAsia="Arial" w:hAnsi="Arial"/>
+                <w:b/>
+                <w:bCs/>
+                <w:color w:val="1A1A1A"/>
+                <w:sz w:val="19"/>
+                <w:szCs w:val="19"/>
+              </w:rPr>
+              <w:t xml:space="preserve">Formularul 230</w:t>
+            </w:r>
+          </w:p>
+        </w:tc>
+        <w:tc>
+          <w:tcPr>
+            <w:tcW w:type="dxa" w:w="6938"/>
+            <w:tcBorders>
+              <w:top w:val="single" w:color="C9D3DE" w:sz="4"/>
+              <w:left w:val="single" w:color="C9D3DE" w:sz="4"/>
+              <w:bottom w:val="single" w:color="C9D3DE" w:sz="4"/>
+              <w:right w:val="single" w:color="C9D3DE" w:sz="4"/>
+            </w:tcBorders>
+            <w:shd w:fill="EEF3F8" w:color="auto" w:val="clear"/>
+            <w:tcMar>
+              <w:top w:type="dxa" w:w="80"/>
+              <w:left w:type="dxa" w:w="120"/>
+              <w:bottom w:type="dxa" w:w="80"/>
+              <w:right w:type="dxa" w:w="120"/>
+            </w:tcMar>
+          </w:tcPr>
+          <w:p>
+            <w:r>
+              <w:rPr>
+                <w:rFonts w:ascii="Arial" w:cs="Arial" w:eastAsia="Arial" w:hAnsi="Arial"/>
+                <w:b w:val="false"/>
+                <w:bCs w:val="false"/>
+                <w:color w:val="1A1A1A"/>
+                <w:sz w:val="19"/>
+                <w:szCs w:val="19"/>
+              </w:rPr>
+              <w:t xml:space="preserve">Formular online pentru redirecționarea a 3,5% din impozit, cu semnătură olografă pe ecran, generare PDF și borderou. CNP-urile sunt criptate.</w:t>
+            </w:r>
+          </w:p>
+        </w:tc>
+      </w:tr>
+      <w:tr>
+        <w:tc>
+          <w:tcPr>
+            <w:tcW w:type="dxa" w:w="2700"/>
+            <w:tcBorders>
+              <w:top w:val="single" w:color="C9D3DE" w:sz="4"/>
+              <w:left w:val="single" w:color="C9D3DE" w:sz="4"/>
+              <w:bottom w:val="single" w:color="C9D3DE" w:sz="4"/>
+              <w:right w:val="single" w:color="C9D3DE" w:sz="4"/>
+            </w:tcBorders>
+            <w:shd w:fill="FFFFFF" w:color="auto" w:val="clear"/>
+            <w:tcMar>
+              <w:top w:type="dxa" w:w="80"/>
+              <w:left w:type="dxa" w:w="120"/>
+              <w:bottom w:type="dxa" w:w="80"/>
+              <w:right w:type="dxa" w:w="120"/>
+            </w:tcMar>
+          </w:tcPr>
+          <w:p>
+            <w:r>
+              <w:rPr>
+                <w:rFonts w:ascii="Arial" w:cs="Arial" w:eastAsia="Arial" w:hAnsi="Arial"/>
+                <w:b/>
+                <w:bCs/>
+                <w:color w:val="1A1A1A"/>
+                <w:sz w:val="19"/>
+                <w:szCs w:val="19"/>
+              </w:rPr>
+              <w:t xml:space="preserve">Companii și sponsorizări</w:t>
+            </w:r>
+          </w:p>
+        </w:tc>
+        <w:tc>
+          <w:tcPr>
+            <w:tcW w:type="dxa" w:w="6938"/>
+            <w:tcBorders>
+              <w:top w:val="single" w:color="C9D3DE" w:sz="4"/>
+              <w:left w:val="single" w:color="C9D3DE" w:sz="4"/>
+              <w:bottom w:val="single" w:color="C9D3DE" w:sz="4"/>
+              <w:right w:val="single" w:color="C9D3DE" w:sz="4"/>
+            </w:tcBorders>
+            <w:shd w:fill="FFFFFF" w:color="auto" w:val="clear"/>
+            <w:tcMar>
+              <w:top w:type="dxa" w:w="80"/>
+              <w:left w:type="dxa" w:w="120"/>
+              <w:bottom w:type="dxa" w:w="80"/>
+              <w:right w:type="dxa" w:w="120"/>
+            </w:tcMar>
+          </w:tcPr>
+          <w:p>
+            <w:r>
+              <w:rPr>
+                <w:rFonts w:ascii="Arial" w:cs="Arial" w:eastAsia="Arial" w:hAnsi="Arial"/>
+                <w:b w:val="false"/>
+                <w:bCs w:val="false"/>
+                <w:color w:val="1A1A1A"/>
+                <w:sz w:val="19"/>
+                <w:szCs w:val="19"/>
+              </w:rPr>
+              <w:t xml:space="preserve">CRM pentru persoane juridice, prospectare, contracte de sponsorizare, declarația D177, verificarea CIF la ANAF.</w:t>
+            </w:r>
+          </w:p>
+        </w:tc>
+      </w:tr>
+      <w:tr>
+        <w:tc>
+          <w:tcPr>
+            <w:tcW w:type="dxa" w:w="2700"/>
+            <w:tcBorders>
+              <w:top w:val="single" w:color="C9D3DE" w:sz="4"/>
+              <w:left w:val="single" w:color="C9D3DE" w:sz="4"/>
+              <w:bottom w:val="single" w:color="C9D3DE" w:sz="4"/>
+              <w:right w:val="single" w:color="C9D3DE" w:sz="4"/>
+            </w:tcBorders>
+            <w:shd w:fill="EEF3F8" w:color="auto" w:val="clear"/>
+            <w:tcMar>
+              <w:top w:type="dxa" w:w="80"/>
+              <w:left w:type="dxa" w:w="120"/>
+              <w:bottom w:type="dxa" w:w="80"/>
+              <w:right w:type="dxa" w:w="120"/>
+            </w:tcMar>
+          </w:tcPr>
+          <w:p>
+            <w:r>
+              <w:rPr>
+                <w:rFonts w:ascii="Arial" w:cs="Arial" w:eastAsia="Arial" w:hAnsi="Arial"/>
+                <w:b/>
+                <w:bCs/>
+                <w:color w:val="1A1A1A"/>
+                <w:sz w:val="19"/>
+                <w:szCs w:val="19"/>
+              </w:rPr>
+              <w:t xml:space="preserve">Strângere de fonduri</w:t>
+            </w:r>
+          </w:p>
+        </w:tc>
+        <w:tc>
+          <w:tcPr>
+            <w:tcW w:type="dxa" w:w="6938"/>
+            <w:tcBorders>
+              <w:top w:val="single" w:color="C9D3DE" w:sz="4"/>
+              <w:left w:val="single" w:color="C9D3DE" w:sz="4"/>
+              <w:bottom w:val="single" w:color="C9D3DE" w:sz="4"/>
+              <w:right w:val="single" w:color="C9D3DE" w:sz="4"/>
+            </w:tcBorders>
+            <w:shd w:fill="EEF3F8" w:color="auto" w:val="clear"/>
+            <w:tcMar>
+              <w:top w:type="dxa" w:w="80"/>
+              <w:left w:type="dxa" w:w="120"/>
+              <w:bottom w:type="dxa" w:w="80"/>
+              <w:right w:type="dxa" w:w="120"/>
+            </w:tcMar>
+          </w:tcPr>
+          <w:p>
+            <w:r>
+              <w:rPr>
+                <w:rFonts w:ascii="Arial" w:cs="Arial" w:eastAsia="Arial" w:hAnsi="Arial"/>
+                <w:b w:val="false"/>
+                <w:bCs w:val="false"/>
+                <w:color w:val="1A1A1A"/>
+                <w:sz w:val="19"/>
+                <w:szCs w:val="19"/>
+              </w:rPr>
+              <w:t xml:space="preserve">Pagini publice de campanie cu donații online prin contul Stripe propriu al fiecărui ONG, actualizări pentru donatori.</w:t>
+            </w:r>
+          </w:p>
+        </w:tc>
+      </w:tr>
+      <w:tr>
+        <w:tc>
+          <w:tcPr>
+            <w:tcW w:type="dxa" w:w="2700"/>
+            <w:tcBorders>
+              <w:top w:val="single" w:color="C9D3DE" w:sz="4"/>
+              <w:left w:val="single" w:color="C9D3DE" w:sz="4"/>
+              <w:bottom w:val="single" w:color="C9D3DE" w:sz="4"/>
+              <w:right w:val="single" w:color="C9D3DE" w:sz="4"/>
+            </w:tcBorders>
+            <w:shd w:fill="FFFFFF" w:color="auto" w:val="clear"/>
+            <w:tcMar>
+              <w:top w:type="dxa" w:w="80"/>
+              <w:left w:type="dxa" w:w="120"/>
+              <w:bottom w:type="dxa" w:w="80"/>
+              <w:right w:type="dxa" w:w="120"/>
+            </w:tcMar>
+          </w:tcPr>
+          <w:p>
+            <w:r>
+              <w:rPr>
+                <w:rFonts w:ascii="Arial" w:cs="Arial" w:eastAsia="Arial" w:hAnsi="Arial"/>
+                <w:b/>
+                <w:bCs/>
+                <w:color w:val="1A1A1A"/>
+                <w:sz w:val="19"/>
+                <w:szCs w:val="19"/>
+              </w:rPr>
+              <w:t xml:space="preserve">Beneficiari și proiecte</w:t>
+            </w:r>
+          </w:p>
+        </w:tc>
+        <w:tc>
+          <w:tcPr>
+            <w:tcW w:type="dxa" w:w="6938"/>
+            <w:tcBorders>
+              <w:top w:val="single" w:color="C9D3DE" w:sz="4"/>
+              <w:left w:val="single" w:color="C9D3DE" w:sz="4"/>
+              <w:bottom w:val="single" w:color="C9D3DE" w:sz="4"/>
+              <w:right w:val="single" w:color="C9D3DE" w:sz="4"/>
+            </w:tcBorders>
+            <w:shd w:fill="FFFFFF" w:color="auto" w:val="clear"/>
+            <w:tcMar>
+              <w:top w:type="dxa" w:w="80"/>
+              <w:left w:type="dxa" w:w="120"/>
+              <w:bottom w:type="dxa" w:w="80"/>
+              <w:right w:type="dxa" w:w="120"/>
+            </w:tcMar>
+          </w:tcPr>
+          <w:p>
+            <w:r>
+              <w:rPr>
+                <w:rFonts w:ascii="Arial" w:cs="Arial" w:eastAsia="Arial" w:hAnsi="Arial"/>
+                <w:b w:val="false"/>
+                <w:bCs w:val="false"/>
+                <w:color w:val="1A1A1A"/>
+                <w:sz w:val="19"/>
+                <w:szCs w:val="19"/>
+              </w:rPr>
+              <w:t xml:space="preserve">Evidența beneficiarilor, a proiectelor și a fondurilor, portal pentru beneficiari.</w:t>
+            </w:r>
+          </w:p>
+        </w:tc>
+      </w:tr>
+      <w:tr>
+        <w:tc>
+          <w:tcPr>
+            <w:tcW w:type="dxa" w:w="2700"/>
+            <w:tcBorders>
+              <w:top w:val="single" w:color="C9D3DE" w:sz="4"/>
+              <w:left w:val="single" w:color="C9D3DE" w:sz="4"/>
+              <w:bottom w:val="single" w:color="C9D3DE" w:sz="4"/>
+              <w:right w:val="single" w:color="C9D3DE" w:sz="4"/>
+            </w:tcBorders>
+            <w:shd w:fill="EEF3F8" w:color="auto" w:val="clear"/>
+            <w:tcMar>
+              <w:top w:type="dxa" w:w="80"/>
+              <w:left w:type="dxa" w:w="120"/>
+              <w:bottom w:type="dxa" w:w="80"/>
+              <w:right w:type="dxa" w:w="120"/>
+            </w:tcMar>
+          </w:tcPr>
+          <w:p>
+            <w:r>
+              <w:rPr>
+                <w:rFonts w:ascii="Arial" w:cs="Arial" w:eastAsia="Arial" w:hAnsi="Arial"/>
+                <w:b/>
+                <w:bCs/>
+                <w:color w:val="1A1A1A"/>
+                <w:sz w:val="19"/>
+                <w:szCs w:val="19"/>
+              </w:rPr>
+              <w:t xml:space="preserve">Presă și comunicare</w:t>
+            </w:r>
+          </w:p>
+        </w:tc>
+        <w:tc>
+          <w:tcPr>
+            <w:tcW w:type="dxa" w:w="6938"/>
+            <w:tcBorders>
+              <w:top w:val="single" w:color="C9D3DE" w:sz="4"/>
+              <w:left w:val="single" w:color="C9D3DE" w:sz="4"/>
+              <w:bottom w:val="single" w:color="C9D3DE" w:sz="4"/>
+              <w:right w:val="single" w:color="C9D3DE" w:sz="4"/>
+            </w:tcBorders>
+            <w:shd w:fill="EEF3F8" w:color="auto" w:val="clear"/>
+            <w:tcMar>
+              <w:top w:type="dxa" w:w="80"/>
+              <w:left w:type="dxa" w:w="120"/>
+              <w:bottom w:type="dxa" w:w="80"/>
+              <w:right w:type="dxa" w:w="120"/>
+            </w:tcMar>
+          </w:tcPr>
+          <w:p>
+            <w:r>
+              <w:rPr>
+                <w:rFonts w:ascii="Arial" w:cs="Arial" w:eastAsia="Arial" w:hAnsi="Arial"/>
+                <w:b w:val="false"/>
+                <w:bCs w:val="false"/>
+                <w:color w:val="1A1A1A"/>
+                <w:sz w:val="19"/>
+                <w:szCs w:val="19"/>
+              </w:rPr>
+              <w:t xml:space="preserve">Comunicate de presă, contacte media, grupuri locale, newslettere pentru persoane fizice și companii.</w:t>
+            </w:r>
+          </w:p>
+        </w:tc>
+      </w:tr>
+      <w:tr>
+        <w:tc>
+          <w:tcPr>
+            <w:tcW w:type="dxa" w:w="2700"/>
+            <w:tcBorders>
+              <w:top w:val="single" w:color="C9D3DE" w:sz="4"/>
+              <w:left w:val="single" w:color="C9D3DE" w:sz="4"/>
+              <w:bottom w:val="single" w:color="C9D3DE" w:sz="4"/>
+              <w:right w:val="single" w:color="C9D3DE" w:sz="4"/>
+            </w:tcBorders>
+            <w:shd w:fill="FFFFFF" w:color="auto" w:val="clear"/>
+            <w:tcMar>
+              <w:top w:type="dxa" w:w="80"/>
+              <w:left w:type="dxa" w:w="120"/>
+              <w:bottom w:type="dxa" w:w="80"/>
+              <w:right w:type="dxa" w:w="120"/>
+            </w:tcMar>
+          </w:tcPr>
+          <w:p>
+            <w:r>
+              <w:rPr>
+                <w:rFonts w:ascii="Arial" w:cs="Arial" w:eastAsia="Arial" w:hAnsi="Arial"/>
+                <w:b/>
+                <w:bCs/>
+                <w:color w:val="1A1A1A"/>
+                <w:sz w:val="19"/>
+                <w:szCs w:val="19"/>
+              </w:rPr>
+              <w:t xml:space="preserve">Rapoarte</w:t>
+            </w:r>
+          </w:p>
+        </w:tc>
+        <w:tc>
+          <w:tcPr>
+            <w:tcW w:type="dxa" w:w="6938"/>
+            <w:tcBorders>
+              <w:top w:val="single" w:color="C9D3DE" w:sz="4"/>
+              <w:left w:val="single" w:color="C9D3DE" w:sz="4"/>
+              <w:bottom w:val="single" w:color="C9D3DE" w:sz="4"/>
+              <w:right w:val="single" w:color="C9D3DE" w:sz="4"/>
+            </w:tcBorders>
+            <w:shd w:fill="FFFFFF" w:color="auto" w:val="clear"/>
+            <w:tcMar>
+              <w:top w:type="dxa" w:w="80"/>
+              <w:left w:type="dxa" w:w="120"/>
+              <w:bottom w:type="dxa" w:w="80"/>
+              <w:right w:type="dxa" w:w="120"/>
+            </w:tcMar>
+          </w:tcPr>
+          <w:p>
+            <w:r>
+              <w:rPr>
+                <w:rFonts w:ascii="Arial" w:cs="Arial" w:eastAsia="Arial" w:hAnsi="Arial"/>
+                <w:b w:val="false"/>
+                <w:bCs w:val="false"/>
+                <w:color w:val="1A1A1A"/>
+                <w:sz w:val="19"/>
+                <w:szCs w:val="19"/>
+              </w:rPr>
+              <w:t xml:space="preserve">Rapoarte de activitate pentru companii, one-pager, rapoarte generate cu ajutorul inteligenței artificiale.</w:t>
+            </w:r>
+          </w:p>
+        </w:tc>
+      </w:tr>
+      <w:tr>
+        <w:tc>
+          <w:tcPr>
+            <w:tcW w:type="dxa" w:w="2700"/>
+            <w:tcBorders>
+              <w:top w:val="single" w:color="C9D3DE" w:sz="4"/>
+              <w:left w:val="single" w:color="C9D3DE" w:sz="4"/>
+              <w:bottom w:val="single" w:color="C9D3DE" w:sz="4"/>
+              <w:right w:val="single" w:color="C9D3DE" w:sz="4"/>
+            </w:tcBorders>
+            <w:shd w:fill="EEF3F8" w:color="auto" w:val="clear"/>
+            <w:tcMar>
+              <w:top w:type="dxa" w:w="80"/>
+              <w:left w:type="dxa" w:w="120"/>
+              <w:bottom w:type="dxa" w:w="80"/>
+              <w:right w:type="dxa" w:w="120"/>
+            </w:tcMar>
+          </w:tcPr>
+          <w:p>
+            <w:r>
+              <w:rPr>
+                <w:rFonts w:ascii="Arial" w:cs="Arial" w:eastAsia="Arial" w:hAnsi="Arial"/>
+                <w:b/>
+                <w:bCs/>
+                <w:color w:val="1A1A1A"/>
+                <w:sz w:val="19"/>
+                <w:szCs w:val="19"/>
+              </w:rPr>
+              <w:t xml:space="preserve">Echipă și KPI</w:t>
+            </w:r>
+          </w:p>
+        </w:tc>
+        <w:tc>
+          <w:tcPr>
+            <w:tcW w:type="dxa" w:w="6938"/>
+            <w:tcBorders>
+              <w:top w:val="single" w:color="C9D3DE" w:sz="4"/>
+              <w:left w:val="single" w:color="C9D3DE" w:sz="4"/>
+              <w:bottom w:val="single" w:color="C9D3DE" w:sz="4"/>
+              <w:right w:val="single" w:color="C9D3DE" w:sz="4"/>
+            </w:tcBorders>
+            <w:shd w:fill="EEF3F8" w:color="auto" w:val="clear"/>
+            <w:tcMar>
+              <w:top w:type="dxa" w:w="80"/>
+              <w:left w:type="dxa" w:w="120"/>
+              <w:bottom w:type="dxa" w:w="80"/>
+              <w:right w:type="dxa" w:w="120"/>
+            </w:tcMar>
+          </w:tcPr>
+          <w:p>
+            <w:r>
+              <w:rPr>
+                <w:rFonts w:ascii="Arial" w:cs="Arial" w:eastAsia="Arial" w:hAnsi="Arial"/>
+                <w:b w:val="false"/>
+                <w:bCs w:val="false"/>
+                <w:color w:val="1A1A1A"/>
+                <w:sz w:val="19"/>
+                <w:szCs w:val="19"/>
+              </w:rPr>
+              <w:t xml:space="preserve">Program de lucru, obiective și indicatori pe angajați, check-in săptămânal, task-uri, voluntari.</w:t>
+            </w:r>
+          </w:p>
+        </w:tc>
+      </w:tr>
+      <w:tr>
+        <w:tc>
+          <w:tcPr>
+            <w:tcW w:type="dxa" w:w="2700"/>
+            <w:tcBorders>
+              <w:top w:val="single" w:color="C9D3DE" w:sz="4"/>
+              <w:left w:val="single" w:color="C9D3DE" w:sz="4"/>
+              <w:bottom w:val="single" w:color="C9D3DE" w:sz="4"/>
+              <w:right w:val="single" w:color="C9D3DE" w:sz="4"/>
+            </w:tcBorders>
+            <w:shd w:fill="FFFFFF" w:color="auto" w:val="clear"/>
+            <w:tcMar>
+              <w:top w:type="dxa" w:w="80"/>
+              <w:left w:type="dxa" w:w="120"/>
+              <w:bottom w:type="dxa" w:w="80"/>
+              <w:right w:type="dxa" w:w="120"/>
+            </w:tcMar>
+          </w:tcPr>
+          <w:p>
+            <w:r>
+              <w:rPr>
+                <w:rFonts w:ascii="Arial" w:cs="Arial" w:eastAsia="Arial" w:hAnsi="Arial"/>
+                <w:b/>
+                <w:bCs/>
+                <w:color w:val="1A1A1A"/>
+                <w:sz w:val="19"/>
+                <w:szCs w:val="19"/>
+              </w:rPr>
+              <w:t xml:space="preserve">Instrumente auxiliare</w:t>
+            </w:r>
+          </w:p>
+        </w:tc>
+        <w:tc>
+          <w:tcPr>
+            <w:tcW w:type="dxa" w:w="6938"/>
+            <w:tcBorders>
+              <w:top w:val="single" w:color="C9D3DE" w:sz="4"/>
+              <w:left w:val="single" w:color="C9D3DE" w:sz="4"/>
+              <w:bottom w:val="single" w:color="C9D3DE" w:sz="4"/>
+              <w:right w:val="single" w:color="C9D3DE" w:sz="4"/>
+            </w:tcBorders>
+            <w:shd w:fill="FFFFFF" w:color="auto" w:val="clear"/>
+            <w:tcMar>
+              <w:top w:type="dxa" w:w="80"/>
+              <w:left w:type="dxa" w:w="120"/>
+              <w:bottom w:type="dxa" w:w="80"/>
+              <w:right w:type="dxa" w:w="120"/>
+            </w:tcMar>
+          </w:tcPr>
+          <w:p>
+            <w:r>
+              <w:rPr>
+                <w:rFonts w:ascii="Arial" w:cs="Arial" w:eastAsia="Arial" w:hAnsi="Arial"/>
+                <w:b w:val="false"/>
+                <w:bCs w:val="false"/>
+                <w:color w:val="1A1A1A"/>
+                <w:sz w:val="19"/>
+                <w:szCs w:val="19"/>
+              </w:rPr>
+              <w:t xml:space="preserve">Apeluri telefonice din browser, semnătură digitală a documentelor, bannere și SMS, consultanță programată.</w:t>
+            </w:r>
+          </w:p>
+        </w:tc>
+      </w:tr>
+      <w:tr>
+        <w:tc>
+          <w:tcPr>
+            <w:tcW w:type="dxa" w:w="2700"/>
+            <w:tcBorders>
+              <w:top w:val="single" w:color="C9D3DE" w:sz="4"/>
+              <w:left w:val="single" w:color="C9D3DE" w:sz="4"/>
+              <w:bottom w:val="single" w:color="C9D3DE" w:sz="4"/>
+              <w:right w:val="single" w:color="C9D3DE" w:sz="4"/>
+            </w:tcBorders>
+            <w:shd w:fill="EEF3F8" w:color="auto" w:val="clear"/>
+            <w:tcMar>
+              <w:top w:type="dxa" w:w="80"/>
+              <w:left w:type="dxa" w:w="120"/>
+              <w:bottom w:type="dxa" w:w="80"/>
+              <w:right w:type="dxa" w:w="120"/>
+            </w:tcMar>
+          </w:tcPr>
+          <w:p>
+            <w:r>
+              <w:rPr>
+                <w:rFonts w:ascii="Arial" w:cs="Arial" w:eastAsia="Arial" w:hAnsi="Arial"/>
+                <w:b/>
+                <w:bCs/>
+                <w:color w:val="1A1A1A"/>
+                <w:sz w:val="19"/>
+                <w:szCs w:val="19"/>
+              </w:rPr>
+              <w:t xml:space="preserve">Abonamente</w:t>
+            </w:r>
+          </w:p>
+        </w:tc>
+        <w:tc>
+          <w:tcPr>
+            <w:tcW w:type="dxa" w:w="6938"/>
+            <w:tcBorders>
+              <w:top w:val="single" w:color="C9D3DE" w:sz="4"/>
+              <w:left w:val="single" w:color="C9D3DE" w:sz="4"/>
+              <w:bottom w:val="single" w:color="C9D3DE" w:sz="4"/>
+              <w:right w:val="single" w:color="C9D3DE" w:sz="4"/>
+            </w:tcBorders>
+            <w:shd w:fill="EEF3F8" w:color="auto" w:val="clear"/>
+            <w:tcMar>
+              <w:top w:type="dxa" w:w="80"/>
+              <w:left w:type="dxa" w:w="120"/>
+              <w:bottom w:type="dxa" w:w="80"/>
+              <w:right w:type="dxa" w:w="120"/>
+            </w:tcMar>
+          </w:tcPr>
+          <w:p>
+            <w:r>
+              <w:rPr>
+                <w:rFonts w:ascii="Arial" w:cs="Arial" w:eastAsia="Arial" w:hAnsi="Arial"/>
+                <w:b w:val="false"/>
+                <w:bCs w:val="false"/>
+                <w:color w:val="1A1A1A"/>
+                <w:sz w:val="19"/>
+                <w:szCs w:val="19"/>
+              </w:rPr>
+              <w:t xml:space="preserve">Pachete lunare plătite prin Netopia, facturare automată prin Oblio.</w:t>
+            </w:r>
+          </w:p>
+        </w:tc>
+      </w:tr>
+    </w:tbl>
+    <w:p>
+      <w:pPr>
+        <w:pStyle w:val="Heading1"/>
+        <w:spacing w:after="160" w:before="360"/>
+      </w:pPr>
+      <w:r>
+        <w:rPr>
+          <w:rFonts w:ascii="Arial" w:cs="Arial" w:eastAsia="Arial" w:hAnsi="Arial"/>
+        </w:rPr>
+        <w:t xml:space="preserve">3. Infrastructura și serviciile afiliate</w:t>
+      </w:r>
+    </w:p>
+    <w:p>
+      <w:pPr>
+        <w:spacing w:after="120" w:line="300"/>
+      </w:pPr>
+      <w:r>
+        <w:rPr>
+          <w:rFonts w:ascii="Arial" w:cs="Arial" w:eastAsia="Arial" w:hAnsi="Arial"/>
+        </w:rPr>
+        <w:t xml:space="preserve">Platforma folosește furnizori specializați pentru fiecare funcție. Mai jos sunt toți furnizorii și datele la care au acces.</w:t>
+      </w:r>
+    </w:p>
+    <w:p>
+      <w:pPr>
+        <w:pStyle w:val="Heading2"/>
+        <w:spacing w:after="120" w:before="240"/>
+      </w:pPr>
+      <w:r>
+        <w:rPr>
+          <w:rFonts w:ascii="Arial" w:cs="Arial" w:eastAsia="Arial" w:hAnsi="Arial"/>
+        </w:rPr>
+        <w:t xml:space="preserve">Infrastructura de bază</w:t>
+      </w:r>
+    </w:p>
+    <w:tbl>
+      <w:tblPr>
+        <w:tblW w:type="dxa" w:w="9638"/>
+        <w:tblBorders>
+          <w:top w:val="single" w:color="auto" w:sz="4"/>
+          <w:left w:val="single" w:color="auto" w:sz="4"/>
+          <w:bottom w:val="single" w:color="auto" w:sz="4"/>
+          <w:right w:val="single" w:color="auto" w:sz="4"/>
+          <w:insideH w:val="single" w:color="auto" w:sz="4"/>
+          <w:insideV w:val="single" w:color="auto" w:sz="4"/>
+        </w:tblBorders>
+      </w:tblPr>
+      <w:tblGrid>
+        <w:gridCol w:w="2000"/>
+        <w:gridCol w:w="2100"/>
+        <w:gridCol w:w="5538"/>
+      </w:tblGrid>
+      <w:tr>
+        <w:trPr>
+          <w:tblHeader/>
+        </w:trPr>
+        <w:tc>
+          <w:tcPr>
+            <w:tcW w:type="dxa" w:w="2000"/>
             <w:tcBorders>
               <w:top w:val="single" w:color="C9D3DE" w:sz="4"/>
               <w:left w:val="single" w:color="C9D3DE" w:sz="4"/>
@@ -358,6 +1078,68 @@
                 <w:sz w:val="19"/>
                 <w:szCs w:val="19"/>
               </w:rPr>
+              <w:t xml:space="preserve">Componentă</w:t>
+            </w:r>
+          </w:p>
+        </w:tc>
+        <w:tc>
+          <w:tcPr>
+            <w:tcW w:type="dxa" w:w="2100"/>
+            <w:tcBorders>
+              <w:top w:val="single" w:color="C9D3DE" w:sz="4"/>
+              <w:left w:val="single" w:color="C9D3DE" w:sz="4"/>
+              <w:bottom w:val="single" w:color="C9D3DE" w:sz="4"/>
+              <w:right w:val="single" w:color="C9D3DE" w:sz="4"/>
+            </w:tcBorders>
+            <w:shd w:fill="0B2A4A" w:color="auto" w:val="clear"/>
+            <w:tcMar>
+              <w:top w:type="dxa" w:w="80"/>
+              <w:left w:type="dxa" w:w="120"/>
+              <w:bottom w:type="dxa" w:w="80"/>
+              <w:right w:type="dxa" w:w="120"/>
+            </w:tcMar>
+          </w:tcPr>
+          <w:p>
+            <w:r>
+              <w:rPr>
+                <w:rFonts w:ascii="Arial" w:cs="Arial" w:eastAsia="Arial" w:hAnsi="Arial"/>
+                <w:b/>
+                <w:bCs/>
+                <w:color w:val="FFFFFF"/>
+                <w:sz w:val="19"/>
+                <w:szCs w:val="19"/>
+              </w:rPr>
+              <w:t xml:space="preserve">Furnizor</w:t>
+            </w:r>
+          </w:p>
+        </w:tc>
+        <w:tc>
+          <w:tcPr>
+            <w:tcW w:type="dxa" w:w="5538"/>
+            <w:tcBorders>
+              <w:top w:val="single" w:color="C9D3DE" w:sz="4"/>
+              <w:left w:val="single" w:color="C9D3DE" w:sz="4"/>
+              <w:bottom w:val="single" w:color="C9D3DE" w:sz="4"/>
+              <w:right w:val="single" w:color="C9D3DE" w:sz="4"/>
+            </w:tcBorders>
+            <w:shd w:fill="0B2A4A" w:color="auto" w:val="clear"/>
+            <w:tcMar>
+              <w:top w:type="dxa" w:w="80"/>
+              <w:left w:type="dxa" w:w="120"/>
+              <w:bottom w:type="dxa" w:w="80"/>
+              <w:right w:type="dxa" w:w="120"/>
+            </w:tcMar>
+          </w:tcPr>
+          <w:p>
+            <w:r>
+              <w:rPr>
+                <w:rFonts w:ascii="Arial" w:cs="Arial" w:eastAsia="Arial" w:hAnsi="Arial"/>
+                <w:b/>
+                <w:bCs/>
+                <w:color w:val="FFFFFF"/>
+                <w:sz w:val="19"/>
+                <w:szCs w:val="19"/>
+              </w:rPr>
               <w:t xml:space="preserve">Rol</w:t>
             </w:r>
           </w:p>
@@ -366,7 +1148,7 @@
       <w:tr>
         <w:tc>
           <w:tcPr>
-            <w:tcW w:type="dxa" w:w="2300"/>
+            <w:tcW w:type="dxa" w:w="2000"/>
             <w:tcBorders>
               <w:top w:val="single" w:color="C9D3DE" w:sz="4"/>
               <w:left w:val="single" w:color="C9D3DE" w:sz="4"/>
@@ -397,7 +1179,7 @@
         </w:tc>
         <w:tc>
           <w:tcPr>
-            <w:tcW w:type="dxa" w:w="2200"/>
+            <w:tcW w:type="dxa" w:w="2100"/>
             <w:tcBorders>
               <w:top w:val="single" w:color="C9D3DE" w:sz="4"/>
               <w:left w:val="single" w:color="C9D3DE" w:sz="4"/>
@@ -428,7 +1210,7 @@
         </w:tc>
         <w:tc>
           <w:tcPr>
-            <w:tcW w:type="dxa" w:w="5138"/>
+            <w:tcW w:type="dxa" w:w="5538"/>
             <w:tcBorders>
               <w:top w:val="single" w:color="C9D3DE" w:sz="4"/>
               <w:left w:val="single" w:color="C9D3DE" w:sz="4"/>
@@ -461,7 +1243,7 @@
       <w:tr>
         <w:tc>
           <w:tcPr>
-            <w:tcW w:type="dxa" w:w="2300"/>
+            <w:tcW w:type="dxa" w:w="2000"/>
             <w:tcBorders>
               <w:top w:val="single" w:color="C9D3DE" w:sz="4"/>
               <w:left w:val="single" w:color="C9D3DE" w:sz="4"/>
@@ -492,7 +1274,7 @@
         </w:tc>
         <w:tc>
           <w:tcPr>
-            <w:tcW w:type="dxa" w:w="2200"/>
+            <w:tcW w:type="dxa" w:w="2100"/>
             <w:tcBorders>
               <w:top w:val="single" w:color="C9D3DE" w:sz="4"/>
               <w:left w:val="single" w:color="C9D3DE" w:sz="4"/>
@@ -523,7 +1305,7 @@
         </w:tc>
         <w:tc>
           <w:tcPr>
-            <w:tcW w:type="dxa" w:w="5138"/>
+            <w:tcW w:type="dxa" w:w="5538"/>
             <w:tcBorders>
               <w:top w:val="single" w:color="C9D3DE" w:sz="4"/>
               <w:left w:val="single" w:color="C9D3DE" w:sz="4"/>
@@ -556,7 +1338,7 @@
       <w:tr>
         <w:tc>
           <w:tcPr>
-            <w:tcW w:type="dxa" w:w="2300"/>
+            <w:tcW w:type="dxa" w:w="2000"/>
             <w:tcBorders>
               <w:top w:val="single" w:color="C9D3DE" w:sz="4"/>
               <w:left w:val="single" w:color="C9D3DE" w:sz="4"/>
@@ -587,7 +1369,7 @@
         </w:tc>
         <w:tc>
           <w:tcPr>
-            <w:tcW w:type="dxa" w:w="2200"/>
+            <w:tcW w:type="dxa" w:w="2100"/>
             <w:tcBorders>
               <w:top w:val="single" w:color="C9D3DE" w:sz="4"/>
               <w:left w:val="single" w:color="C9D3DE" w:sz="4"/>
@@ -618,7 +1400,7 @@
         </w:tc>
         <w:tc>
           <w:tcPr>
-            <w:tcW w:type="dxa" w:w="5138"/>
+            <w:tcW w:type="dxa" w:w="5538"/>
             <w:tcBorders>
               <w:top w:val="single" w:color="C9D3DE" w:sz="4"/>
               <w:left w:val="single" w:color="C9D3DE" w:sz="4"/>
@@ -651,7 +1433,7 @@
       <w:tr>
         <w:tc>
           <w:tcPr>
-            <w:tcW w:type="dxa" w:w="2300"/>
+            <w:tcW w:type="dxa" w:w="2000"/>
             <w:tcBorders>
               <w:top w:val="single" w:color="C9D3DE" w:sz="4"/>
               <w:left w:val="single" w:color="C9D3DE" w:sz="4"/>
@@ -682,7 +1464,7 @@
         </w:tc>
         <w:tc>
           <w:tcPr>
-            <w:tcW w:type="dxa" w:w="2200"/>
+            <w:tcW w:type="dxa" w:w="2100"/>
             <w:tcBorders>
               <w:top w:val="single" w:color="C9D3DE" w:sz="4"/>
               <w:left w:val="single" w:color="C9D3DE" w:sz="4"/>
@@ -713,7 +1495,7 @@
         </w:tc>
         <w:tc>
           <w:tcPr>
-            <w:tcW w:type="dxa" w:w="5138"/>
+            <w:tcW w:type="dxa" w:w="5538"/>
             <w:tcBorders>
               <w:top w:val="single" w:color="C9D3DE" w:sz="4"/>
               <w:left w:val="single" w:color="C9D3DE" w:sz="4"/>
@@ -746,7 +1528,7 @@
       <w:tr>
         <w:tc>
           <w:tcPr>
-            <w:tcW w:type="dxa" w:w="2300"/>
+            <w:tcW w:type="dxa" w:w="2000"/>
             <w:tcBorders>
               <w:top w:val="single" w:color="C9D3DE" w:sz="4"/>
               <w:left w:val="single" w:color="C9D3DE" w:sz="4"/>
@@ -771,13 +1553,13 @@
                 <w:sz w:val="19"/>
                 <w:szCs w:val="19"/>
               </w:rPr>
-              <w:t xml:space="preserve">Plăți</w:t>
-            </w:r>
-          </w:p>
-        </w:tc>
-        <w:tc>
-          <w:tcPr>
-            <w:tcW w:type="dxa" w:w="2200"/>
+              <w:t xml:space="preserve">Cod sursă</w:t>
+            </w:r>
+          </w:p>
+        </w:tc>
+        <w:tc>
+          <w:tcPr>
+            <w:tcW w:type="dxa" w:w="2100"/>
             <w:tcBorders>
               <w:top w:val="single" w:color="C9D3DE" w:sz="4"/>
               <w:left w:val="single" w:color="C9D3DE" w:sz="4"/>
@@ -802,13 +1584,13 @@
                 <w:sz w:val="19"/>
                 <w:szCs w:val="19"/>
               </w:rPr>
-              <w:t xml:space="preserve">Netopia, Stripe</w:t>
-            </w:r>
-          </w:p>
-        </w:tc>
-        <w:tc>
-          <w:tcPr>
-            <w:tcW w:type="dxa" w:w="5138"/>
+              <w:t xml:space="preserve">GitHub</w:t>
+            </w:r>
+          </w:p>
+        </w:tc>
+        <w:tc>
+          <w:tcPr>
+            <w:tcW w:type="dxa" w:w="5538"/>
             <w:tcBorders>
               <w:top w:val="single" w:color="C9D3DE" w:sz="4"/>
               <w:left w:val="single" w:color="C9D3DE" w:sz="4"/>
@@ -833,7 +1615,135 @@
                 <w:sz w:val="19"/>
                 <w:szCs w:val="19"/>
               </w:rPr>
-              <w:t xml:space="preserve">Datele de card nu ajung niciodată pe serverele platformei, ci sunt procesate direct de procesatori certificați PCI DSS.</w:t>
+              <w:t xml:space="preserve">Istoric complet al modificărilor, verificări automate la fiecare schimbare.</w:t>
+            </w:r>
+          </w:p>
+        </w:tc>
+      </w:tr>
+    </w:tbl>
+    <w:p>
+      <w:pPr>
+        <w:pStyle w:val="Heading2"/>
+        <w:spacing w:after="120" w:before="240"/>
+      </w:pPr>
+      <w:r>
+        <w:rPr>
+          <w:rFonts w:ascii="Arial" w:cs="Arial" w:eastAsia="Arial" w:hAnsi="Arial"/>
+        </w:rPr>
+        <w:t xml:space="preserve">Servicii afiliate</w:t>
+      </w:r>
+    </w:p>
+    <w:tbl>
+      <w:tblPr>
+        <w:tblW w:type="dxa" w:w="9638"/>
+        <w:tblBorders>
+          <w:top w:val="single" w:color="auto" w:sz="4"/>
+          <w:left w:val="single" w:color="auto" w:sz="4"/>
+          <w:bottom w:val="single" w:color="auto" w:sz="4"/>
+          <w:right w:val="single" w:color="auto" w:sz="4"/>
+          <w:insideH w:val="single" w:color="auto" w:sz="4"/>
+          <w:insideV w:val="single" w:color="auto" w:sz="4"/>
+        </w:tblBorders>
+      </w:tblPr>
+      <w:tblGrid>
+        <w:gridCol w:w="1900"/>
+        <w:gridCol w:w="3000"/>
+        <w:gridCol w:w="4738"/>
+      </w:tblGrid>
+      <w:tr>
+        <w:trPr>
+          <w:tblHeader/>
+        </w:trPr>
+        <w:tc>
+          <w:tcPr>
+            <w:tcW w:type="dxa" w:w="1900"/>
+            <w:tcBorders>
+              <w:top w:val="single" w:color="C9D3DE" w:sz="4"/>
+              <w:left w:val="single" w:color="C9D3DE" w:sz="4"/>
+              <w:bottom w:val="single" w:color="C9D3DE" w:sz="4"/>
+              <w:right w:val="single" w:color="C9D3DE" w:sz="4"/>
+            </w:tcBorders>
+            <w:shd w:fill="0B2A4A" w:color="auto" w:val="clear"/>
+            <w:tcMar>
+              <w:top w:type="dxa" w:w="80"/>
+              <w:left w:type="dxa" w:w="120"/>
+              <w:bottom w:type="dxa" w:w="80"/>
+              <w:right w:type="dxa" w:w="120"/>
+            </w:tcMar>
+          </w:tcPr>
+          <w:p>
+            <w:r>
+              <w:rPr>
+                <w:rFonts w:ascii="Arial" w:cs="Arial" w:eastAsia="Arial" w:hAnsi="Arial"/>
+                <w:b/>
+                <w:bCs/>
+                <w:color w:val="FFFFFF"/>
+                <w:sz w:val="19"/>
+                <w:szCs w:val="19"/>
+              </w:rPr>
+              <w:t xml:space="preserve">Serviciu</w:t>
+            </w:r>
+          </w:p>
+        </w:tc>
+        <w:tc>
+          <w:tcPr>
+            <w:tcW w:type="dxa" w:w="3000"/>
+            <w:tcBorders>
+              <w:top w:val="single" w:color="C9D3DE" w:sz="4"/>
+              <w:left w:val="single" w:color="C9D3DE" w:sz="4"/>
+              <w:bottom w:val="single" w:color="C9D3DE" w:sz="4"/>
+              <w:right w:val="single" w:color="C9D3DE" w:sz="4"/>
+            </w:tcBorders>
+            <w:shd w:fill="0B2A4A" w:color="auto" w:val="clear"/>
+            <w:tcMar>
+              <w:top w:type="dxa" w:w="80"/>
+              <w:left w:type="dxa" w:w="120"/>
+              <w:bottom w:type="dxa" w:w="80"/>
+              <w:right w:type="dxa" w:w="120"/>
+            </w:tcMar>
+          </w:tcPr>
+          <w:p>
+            <w:r>
+              <w:rPr>
+                <w:rFonts w:ascii="Arial" w:cs="Arial" w:eastAsia="Arial" w:hAnsi="Arial"/>
+                <w:b/>
+                <w:bCs/>
+                <w:color w:val="FFFFFF"/>
+                <w:sz w:val="19"/>
+                <w:szCs w:val="19"/>
+              </w:rPr>
+              <w:t xml:space="preserve">Pentru ce îl folosim</w:t>
+            </w:r>
+          </w:p>
+        </w:tc>
+        <w:tc>
+          <w:tcPr>
+            <w:tcW w:type="dxa" w:w="4738"/>
+            <w:tcBorders>
+              <w:top w:val="single" w:color="C9D3DE" w:sz="4"/>
+              <w:left w:val="single" w:color="C9D3DE" w:sz="4"/>
+              <w:bottom w:val="single" w:color="C9D3DE" w:sz="4"/>
+              <w:right w:val="single" w:color="C9D3DE" w:sz="4"/>
+            </w:tcBorders>
+            <w:shd w:fill="0B2A4A" w:color="auto" w:val="clear"/>
+            <w:tcMar>
+              <w:top w:type="dxa" w:w="80"/>
+              <w:left w:type="dxa" w:w="120"/>
+              <w:bottom w:type="dxa" w:w="80"/>
+              <w:right w:type="dxa" w:w="120"/>
+            </w:tcMar>
+          </w:tcPr>
+          <w:p>
+            <w:r>
+              <w:rPr>
+                <w:rFonts w:ascii="Arial" w:cs="Arial" w:eastAsia="Arial" w:hAnsi="Arial"/>
+                <w:b/>
+                <w:bCs/>
+                <w:color w:val="FFFFFF"/>
+                <w:sz w:val="19"/>
+                <w:szCs w:val="19"/>
+              </w:rPr>
+              <w:t xml:space="preserve">Date și securitate</w:t>
             </w:r>
           </w:p>
         </w:tc>
@@ -841,14 +1751,14 @@
       <w:tr>
         <w:tc>
           <w:tcPr>
-            <w:tcW w:type="dxa" w:w="2300"/>
-            <w:tcBorders>
-              <w:top w:val="single" w:color="C9D3DE" w:sz="4"/>
-              <w:left w:val="single" w:color="C9D3DE" w:sz="4"/>
-              <w:bottom w:val="single" w:color="C9D3DE" w:sz="4"/>
-              <w:right w:val="single" w:color="C9D3DE" w:sz="4"/>
-            </w:tcBorders>
-            <w:shd w:fill="EEF3F8" w:color="auto" w:val="clear"/>
+            <w:tcW w:type="dxa" w:w="1900"/>
+            <w:tcBorders>
+              <w:top w:val="single" w:color="C9D3DE" w:sz="4"/>
+              <w:left w:val="single" w:color="C9D3DE" w:sz="4"/>
+              <w:bottom w:val="single" w:color="C9D3DE" w:sz="4"/>
+              <w:right w:val="single" w:color="C9D3DE" w:sz="4"/>
+            </w:tcBorders>
+            <w:shd w:fill="FFFFFF" w:color="auto" w:val="clear"/>
             <w:tcMar>
               <w:top w:type="dxa" w:w="80"/>
               <w:left w:type="dxa" w:w="120"/>
@@ -866,69 +1776,69 @@
                 <w:sz w:val="19"/>
                 <w:szCs w:val="19"/>
               </w:rPr>
-              <w:t xml:space="preserve">Monitorizare erori</w:t>
-            </w:r>
-          </w:p>
-        </w:tc>
-        <w:tc>
-          <w:tcPr>
-            <w:tcW w:type="dxa" w:w="2200"/>
-            <w:tcBorders>
-              <w:top w:val="single" w:color="C9D3DE" w:sz="4"/>
-              <w:left w:val="single" w:color="C9D3DE" w:sz="4"/>
-              <w:bottom w:val="single" w:color="C9D3DE" w:sz="4"/>
-              <w:right w:val="single" w:color="C9D3DE" w:sz="4"/>
-            </w:tcBorders>
-            <w:shd w:fill="EEF3F8" w:color="auto" w:val="clear"/>
-            <w:tcMar>
-              <w:top w:type="dxa" w:w="80"/>
-              <w:left w:type="dxa" w:w="120"/>
-              <w:bottom w:type="dxa" w:w="80"/>
-              <w:right w:type="dxa" w:w="120"/>
-            </w:tcMar>
-          </w:tcPr>
-          <w:p>
-            <w:r>
-              <w:rPr>
-                <w:rFonts w:ascii="Arial" w:cs="Arial" w:eastAsia="Arial" w:hAnsi="Arial"/>
-                <w:b w:val="false"/>
-                <w:bCs w:val="false"/>
-                <w:color w:val="1A1A1A"/>
-                <w:sz w:val="19"/>
-                <w:szCs w:val="19"/>
-              </w:rPr>
-              <w:t xml:space="preserve">Sentry (regiunea UE)</w:t>
-            </w:r>
-          </w:p>
-        </w:tc>
-        <w:tc>
-          <w:tcPr>
-            <w:tcW w:type="dxa" w:w="5138"/>
-            <w:tcBorders>
-              <w:top w:val="single" w:color="C9D3DE" w:sz="4"/>
-              <w:left w:val="single" w:color="C9D3DE" w:sz="4"/>
-              <w:bottom w:val="single" w:color="C9D3DE" w:sz="4"/>
-              <w:right w:val="single" w:color="C9D3DE" w:sz="4"/>
-            </w:tcBorders>
-            <w:shd w:fill="EEF3F8" w:color="auto" w:val="clear"/>
-            <w:tcMar>
-              <w:top w:type="dxa" w:w="80"/>
-              <w:left w:type="dxa" w:w="120"/>
-              <w:bottom w:type="dxa" w:w="80"/>
-              <w:right w:type="dxa" w:w="120"/>
-            </w:tcMar>
-          </w:tcPr>
-          <w:p>
-            <w:r>
-              <w:rPr>
-                <w:rFonts w:ascii="Arial" w:cs="Arial" w:eastAsia="Arial" w:hAnsi="Arial"/>
-                <w:b w:val="false"/>
-                <w:bCs w:val="false"/>
-                <w:color w:val="1A1A1A"/>
-                <w:sz w:val="19"/>
-                <w:szCs w:val="19"/>
-              </w:rPr>
-              <w:t xml:space="preserve">Alertă la erori, fără a trimite date dacă nu este configurat.</w:t>
+              <w:t xml:space="preserve">Stripe</w:t>
+            </w:r>
+          </w:p>
+        </w:tc>
+        <w:tc>
+          <w:tcPr>
+            <w:tcW w:type="dxa" w:w="3000"/>
+            <w:tcBorders>
+              <w:top w:val="single" w:color="C9D3DE" w:sz="4"/>
+              <w:left w:val="single" w:color="C9D3DE" w:sz="4"/>
+              <w:bottom w:val="single" w:color="C9D3DE" w:sz="4"/>
+              <w:right w:val="single" w:color="C9D3DE" w:sz="4"/>
+            </w:tcBorders>
+            <w:shd w:fill="FFFFFF" w:color="auto" w:val="clear"/>
+            <w:tcMar>
+              <w:top w:type="dxa" w:w="80"/>
+              <w:left w:type="dxa" w:w="120"/>
+              <w:bottom w:type="dxa" w:w="80"/>
+              <w:right w:type="dxa" w:w="120"/>
+            </w:tcMar>
+          </w:tcPr>
+          <w:p>
+            <w:r>
+              <w:rPr>
+                <w:rFonts w:ascii="Arial" w:cs="Arial" w:eastAsia="Arial" w:hAnsi="Arial"/>
+                <w:b w:val="false"/>
+                <w:bCs w:val="false"/>
+                <w:color w:val="1A1A1A"/>
+                <w:sz w:val="19"/>
+                <w:szCs w:val="19"/>
+              </w:rPr>
+              <w:t xml:space="preserve">Donațiile online de pe paginile ONG-urilor, în contul Stripe al fiecărui ONG</w:t>
+            </w:r>
+          </w:p>
+        </w:tc>
+        <w:tc>
+          <w:tcPr>
+            <w:tcW w:type="dxa" w:w="4738"/>
+            <w:tcBorders>
+              <w:top w:val="single" w:color="C9D3DE" w:sz="4"/>
+              <w:left w:val="single" w:color="C9D3DE" w:sz="4"/>
+              <w:bottom w:val="single" w:color="C9D3DE" w:sz="4"/>
+              <w:right w:val="single" w:color="C9D3DE" w:sz="4"/>
+            </w:tcBorders>
+            <w:shd w:fill="FFFFFF" w:color="auto" w:val="clear"/>
+            <w:tcMar>
+              <w:top w:type="dxa" w:w="80"/>
+              <w:left w:type="dxa" w:w="120"/>
+              <w:bottom w:type="dxa" w:w="80"/>
+              <w:right w:type="dxa" w:w="120"/>
+            </w:tcMar>
+          </w:tcPr>
+          <w:p>
+            <w:r>
+              <w:rPr>
+                <w:rFonts w:ascii="Arial" w:cs="Arial" w:eastAsia="Arial" w:hAnsi="Arial"/>
+                <w:b w:val="false"/>
+                <w:bCs w:val="false"/>
+                <w:color w:val="1A1A1A"/>
+                <w:sz w:val="19"/>
+                <w:szCs w:val="19"/>
+              </w:rPr>
+              <w:t xml:space="preserve">Datele de card nu ajung la platformă. Certificat PCI DSS Level 1.</w:t>
             </w:r>
           </w:p>
         </w:tc>
@@ -936,14 +1846,14 @@
       <w:tr>
         <w:tc>
           <w:tcPr>
-            <w:tcW w:type="dxa" w:w="2300"/>
-            <w:tcBorders>
-              <w:top w:val="single" w:color="C9D3DE" w:sz="4"/>
-              <w:left w:val="single" w:color="C9D3DE" w:sz="4"/>
-              <w:bottom w:val="single" w:color="C9D3DE" w:sz="4"/>
-              <w:right w:val="single" w:color="C9D3DE" w:sz="4"/>
-            </w:tcBorders>
-            <w:shd w:fill="FFFFFF" w:color="auto" w:val="clear"/>
+            <w:tcW w:type="dxa" w:w="1900"/>
+            <w:tcBorders>
+              <w:top w:val="single" w:color="C9D3DE" w:sz="4"/>
+              <w:left w:val="single" w:color="C9D3DE" w:sz="4"/>
+              <w:bottom w:val="single" w:color="C9D3DE" w:sz="4"/>
+              <w:right w:val="single" w:color="C9D3DE" w:sz="4"/>
+            </w:tcBorders>
+            <w:shd w:fill="EEF3F8" w:color="auto" w:val="clear"/>
             <w:tcMar>
               <w:top w:type="dxa" w:w="80"/>
               <w:left w:type="dxa" w:w="120"/>
@@ -961,13 +1871,77 @@
                 <w:sz w:val="19"/>
                 <w:szCs w:val="19"/>
               </w:rPr>
-              <w:t xml:space="preserve">Cod sursă</w:t>
-            </w:r>
-          </w:p>
-        </w:tc>
-        <w:tc>
-          <w:tcPr>
-            <w:tcW w:type="dxa" w:w="2200"/>
+              <w:t xml:space="preserve">Netopia Payments</w:t>
+            </w:r>
+          </w:p>
+        </w:tc>
+        <w:tc>
+          <w:tcPr>
+            <w:tcW w:type="dxa" w:w="3000"/>
+            <w:tcBorders>
+              <w:top w:val="single" w:color="C9D3DE" w:sz="4"/>
+              <w:left w:val="single" w:color="C9D3DE" w:sz="4"/>
+              <w:bottom w:val="single" w:color="C9D3DE" w:sz="4"/>
+              <w:right w:val="single" w:color="C9D3DE" w:sz="4"/>
+            </w:tcBorders>
+            <w:shd w:fill="EEF3F8" w:color="auto" w:val="clear"/>
+            <w:tcMar>
+              <w:top w:type="dxa" w:w="80"/>
+              <w:left w:type="dxa" w:w="120"/>
+              <w:bottom w:type="dxa" w:w="80"/>
+              <w:right w:type="dxa" w:w="120"/>
+            </w:tcMar>
+          </w:tcPr>
+          <w:p>
+            <w:r>
+              <w:rPr>
+                <w:rFonts w:ascii="Arial" w:cs="Arial" w:eastAsia="Arial" w:hAnsi="Arial"/>
+                <w:b w:val="false"/>
+                <w:bCs w:val="false"/>
+                <w:color w:val="1A1A1A"/>
+                <w:sz w:val="19"/>
+                <w:szCs w:val="19"/>
+              </w:rPr>
+              <w:t xml:space="preserve">Plata abonamentelor platformei</w:t>
+            </w:r>
+          </w:p>
+        </w:tc>
+        <w:tc>
+          <w:tcPr>
+            <w:tcW w:type="dxa" w:w="4738"/>
+            <w:tcBorders>
+              <w:top w:val="single" w:color="C9D3DE" w:sz="4"/>
+              <w:left w:val="single" w:color="C9D3DE" w:sz="4"/>
+              <w:bottom w:val="single" w:color="C9D3DE" w:sz="4"/>
+              <w:right w:val="single" w:color="C9D3DE" w:sz="4"/>
+            </w:tcBorders>
+            <w:shd w:fill="EEF3F8" w:color="auto" w:val="clear"/>
+            <w:tcMar>
+              <w:top w:type="dxa" w:w="80"/>
+              <w:left w:type="dxa" w:w="120"/>
+              <w:bottom w:type="dxa" w:w="80"/>
+              <w:right w:type="dxa" w:w="120"/>
+            </w:tcMar>
+          </w:tcPr>
+          <w:p>
+            <w:r>
+              <w:rPr>
+                <w:rFonts w:ascii="Arial" w:cs="Arial" w:eastAsia="Arial" w:hAnsi="Arial"/>
+                <w:b w:val="false"/>
+                <w:bCs w:val="false"/>
+                <w:color w:val="1A1A1A"/>
+                <w:sz w:val="19"/>
+                <w:szCs w:val="19"/>
+              </w:rPr>
+              <w:t xml:space="preserve">Procesator român certificat PCI DSS. Plata se face pe pagina securizată Netopia.</w:t>
+            </w:r>
+          </w:p>
+        </w:tc>
+      </w:tr>
+      <w:tr>
+        <w:tc>
+          <w:tcPr>
+            <w:tcW w:type="dxa" w:w="1900"/>
             <w:tcBorders>
               <w:top w:val="single" w:color="C9D3DE" w:sz="4"/>
               <w:left w:val="single" w:color="C9D3DE" w:sz="4"/>
@@ -986,19 +1960,19 @@
             <w:r>
               <w:rPr>
                 <w:rFonts w:ascii="Arial" w:cs="Arial" w:eastAsia="Arial" w:hAnsi="Arial"/>
-                <w:b w:val="false"/>
-                <w:bCs w:val="false"/>
-                <w:color w:val="1A1A1A"/>
-                <w:sz w:val="19"/>
-                <w:szCs w:val="19"/>
-              </w:rPr>
-              <w:t xml:space="preserve">GitHub</w:t>
-            </w:r>
-          </w:p>
-        </w:tc>
-        <w:tc>
-          <w:tcPr>
-            <w:tcW w:type="dxa" w:w="5138"/>
+                <w:b/>
+                <w:bCs/>
+                <w:color w:val="1A1A1A"/>
+                <w:sz w:val="19"/>
+                <w:szCs w:val="19"/>
+              </w:rPr>
+              <w:t xml:space="preserve">Oblio</w:t>
+            </w:r>
+          </w:p>
+        </w:tc>
+        <w:tc>
+          <w:tcPr>
+            <w:tcW w:type="dxa" w:w="3000"/>
             <w:tcBorders>
               <w:top w:val="single" w:color="C9D3DE" w:sz="4"/>
               <w:left w:val="single" w:color="C9D3DE" w:sz="4"/>
@@ -1023,7 +1997,893 @@
                 <w:sz w:val="19"/>
                 <w:szCs w:val="19"/>
               </w:rPr>
-              <w:t xml:space="preserve">Istoric complet al modificărilor, verificări automate la fiecare schimbare.</w:t>
+              <w:t xml:space="preserve">Emiterea facturilor pentru abonamente, cu transmitere e-Factura</w:t>
+            </w:r>
+          </w:p>
+        </w:tc>
+        <w:tc>
+          <w:tcPr>
+            <w:tcW w:type="dxa" w:w="4738"/>
+            <w:tcBorders>
+              <w:top w:val="single" w:color="C9D3DE" w:sz="4"/>
+              <w:left w:val="single" w:color="C9D3DE" w:sz="4"/>
+              <w:bottom w:val="single" w:color="C9D3DE" w:sz="4"/>
+              <w:right w:val="single" w:color="C9D3DE" w:sz="4"/>
+            </w:tcBorders>
+            <w:shd w:fill="FFFFFF" w:color="auto" w:val="clear"/>
+            <w:tcMar>
+              <w:top w:type="dxa" w:w="80"/>
+              <w:left w:type="dxa" w:w="120"/>
+              <w:bottom w:type="dxa" w:w="80"/>
+              <w:right w:type="dxa" w:w="120"/>
+            </w:tcMar>
+          </w:tcPr>
+          <w:p>
+            <w:r>
+              <w:rPr>
+                <w:rFonts w:ascii="Arial" w:cs="Arial" w:eastAsia="Arial" w:hAnsi="Arial"/>
+                <w:b w:val="false"/>
+                <w:bCs w:val="false"/>
+                <w:color w:val="1A1A1A"/>
+                <w:sz w:val="19"/>
+                <w:szCs w:val="19"/>
+              </w:rPr>
+              <w:t xml:space="preserve">Furnizor român de facturare. Primește doar datele de facturare.</w:t>
+            </w:r>
+          </w:p>
+        </w:tc>
+      </w:tr>
+      <w:tr>
+        <w:tc>
+          <w:tcPr>
+            <w:tcW w:type="dxa" w:w="1900"/>
+            <w:tcBorders>
+              <w:top w:val="single" w:color="C9D3DE" w:sz="4"/>
+              <w:left w:val="single" w:color="C9D3DE" w:sz="4"/>
+              <w:bottom w:val="single" w:color="C9D3DE" w:sz="4"/>
+              <w:right w:val="single" w:color="C9D3DE" w:sz="4"/>
+            </w:tcBorders>
+            <w:shd w:fill="EEF3F8" w:color="auto" w:val="clear"/>
+            <w:tcMar>
+              <w:top w:type="dxa" w:w="80"/>
+              <w:left w:type="dxa" w:w="120"/>
+              <w:bottom w:type="dxa" w:w="80"/>
+              <w:right w:type="dxa" w:w="120"/>
+            </w:tcMar>
+          </w:tcPr>
+          <w:p>
+            <w:r>
+              <w:rPr>
+                <w:rFonts w:ascii="Arial" w:cs="Arial" w:eastAsia="Arial" w:hAnsi="Arial"/>
+                <w:b/>
+                <w:bCs/>
+                <w:color w:val="1A1A1A"/>
+                <w:sz w:val="19"/>
+                <w:szCs w:val="19"/>
+              </w:rPr>
+              <w:t xml:space="preserve">ANAF (API public)</w:t>
+            </w:r>
+          </w:p>
+        </w:tc>
+        <w:tc>
+          <w:tcPr>
+            <w:tcW w:type="dxa" w:w="3000"/>
+            <w:tcBorders>
+              <w:top w:val="single" w:color="C9D3DE" w:sz="4"/>
+              <w:left w:val="single" w:color="C9D3DE" w:sz="4"/>
+              <w:bottom w:val="single" w:color="C9D3DE" w:sz="4"/>
+              <w:right w:val="single" w:color="C9D3DE" w:sz="4"/>
+            </w:tcBorders>
+            <w:shd w:fill="EEF3F8" w:color="auto" w:val="clear"/>
+            <w:tcMar>
+              <w:top w:type="dxa" w:w="80"/>
+              <w:left w:type="dxa" w:w="120"/>
+              <w:bottom w:type="dxa" w:w="80"/>
+              <w:right w:type="dxa" w:w="120"/>
+            </w:tcMar>
+          </w:tcPr>
+          <w:p>
+            <w:r>
+              <w:rPr>
+                <w:rFonts w:ascii="Arial" w:cs="Arial" w:eastAsia="Arial" w:hAnsi="Arial"/>
+                <w:b w:val="false"/>
+                <w:bCs w:val="false"/>
+                <w:color w:val="1A1A1A"/>
+                <w:sz w:val="19"/>
+                <w:szCs w:val="19"/>
+              </w:rPr>
+              <w:t xml:space="preserve">Verificarea CIF-ului la înscriere și la adăugarea companiilor</w:t>
+            </w:r>
+          </w:p>
+        </w:tc>
+        <w:tc>
+          <w:tcPr>
+            <w:tcW w:type="dxa" w:w="4738"/>
+            <w:tcBorders>
+              <w:top w:val="single" w:color="C9D3DE" w:sz="4"/>
+              <w:left w:val="single" w:color="C9D3DE" w:sz="4"/>
+              <w:bottom w:val="single" w:color="C9D3DE" w:sz="4"/>
+              <w:right w:val="single" w:color="C9D3DE" w:sz="4"/>
+            </w:tcBorders>
+            <w:shd w:fill="EEF3F8" w:color="auto" w:val="clear"/>
+            <w:tcMar>
+              <w:top w:type="dxa" w:w="80"/>
+              <w:left w:type="dxa" w:w="120"/>
+              <w:bottom w:type="dxa" w:w="80"/>
+              <w:right w:type="dxa" w:w="120"/>
+            </w:tcMar>
+          </w:tcPr>
+          <w:p>
+            <w:r>
+              <w:rPr>
+                <w:rFonts w:ascii="Arial" w:cs="Arial" w:eastAsia="Arial" w:hAnsi="Arial"/>
+                <w:b w:val="false"/>
+                <w:bCs w:val="false"/>
+                <w:color w:val="1A1A1A"/>
+                <w:sz w:val="19"/>
+                <w:szCs w:val="19"/>
+              </w:rPr>
+              <w:t xml:space="preserve">Serviciu public al statului. Se trimite doar CIF-ul.</w:t>
+            </w:r>
+          </w:p>
+        </w:tc>
+      </w:tr>
+      <w:tr>
+        <w:tc>
+          <w:tcPr>
+            <w:tcW w:type="dxa" w:w="1900"/>
+            <w:tcBorders>
+              <w:top w:val="single" w:color="C9D3DE" w:sz="4"/>
+              <w:left w:val="single" w:color="C9D3DE" w:sz="4"/>
+              <w:bottom w:val="single" w:color="C9D3DE" w:sz="4"/>
+              <w:right w:val="single" w:color="C9D3DE" w:sz="4"/>
+            </w:tcBorders>
+            <w:shd w:fill="FFFFFF" w:color="auto" w:val="clear"/>
+            <w:tcMar>
+              <w:top w:type="dxa" w:w="80"/>
+              <w:left w:type="dxa" w:w="120"/>
+              <w:bottom w:type="dxa" w:w="80"/>
+              <w:right w:type="dxa" w:w="120"/>
+            </w:tcMar>
+          </w:tcPr>
+          <w:p>
+            <w:r>
+              <w:rPr>
+                <w:rFonts w:ascii="Arial" w:cs="Arial" w:eastAsia="Arial" w:hAnsi="Arial"/>
+                <w:b/>
+                <w:bCs/>
+                <w:color w:val="1A1A1A"/>
+                <w:sz w:val="19"/>
+                <w:szCs w:val="19"/>
+              </w:rPr>
+              <w:t xml:space="preserve">Resend / SMTP propriu</w:t>
+            </w:r>
+          </w:p>
+        </w:tc>
+        <w:tc>
+          <w:tcPr>
+            <w:tcW w:type="dxa" w:w="3000"/>
+            <w:tcBorders>
+              <w:top w:val="single" w:color="C9D3DE" w:sz="4"/>
+              <w:left w:val="single" w:color="C9D3DE" w:sz="4"/>
+              <w:bottom w:val="single" w:color="C9D3DE" w:sz="4"/>
+              <w:right w:val="single" w:color="C9D3DE" w:sz="4"/>
+            </w:tcBorders>
+            <w:shd w:fill="FFFFFF" w:color="auto" w:val="clear"/>
+            <w:tcMar>
+              <w:top w:type="dxa" w:w="80"/>
+              <w:left w:type="dxa" w:w="120"/>
+              <w:bottom w:type="dxa" w:w="80"/>
+              <w:right w:type="dxa" w:w="120"/>
+            </w:tcMar>
+          </w:tcPr>
+          <w:p>
+            <w:r>
+              <w:rPr>
+                <w:rFonts w:ascii="Arial" w:cs="Arial" w:eastAsia="Arial" w:hAnsi="Arial"/>
+                <w:b w:val="false"/>
+                <w:bCs w:val="false"/>
+                <w:color w:val="1A1A1A"/>
+                <w:sz w:val="19"/>
+                <w:szCs w:val="19"/>
+              </w:rPr>
+              <w:t xml:space="preserve">Emailuri de autentificare, invitații, chitanțe, newslettere</w:t>
+            </w:r>
+          </w:p>
+        </w:tc>
+        <w:tc>
+          <w:tcPr>
+            <w:tcW w:type="dxa" w:w="4738"/>
+            <w:tcBorders>
+              <w:top w:val="single" w:color="C9D3DE" w:sz="4"/>
+              <w:left w:val="single" w:color="C9D3DE" w:sz="4"/>
+              <w:bottom w:val="single" w:color="C9D3DE" w:sz="4"/>
+              <w:right w:val="single" w:color="C9D3DE" w:sz="4"/>
+            </w:tcBorders>
+            <w:shd w:fill="FFFFFF" w:color="auto" w:val="clear"/>
+            <w:tcMar>
+              <w:top w:type="dxa" w:w="80"/>
+              <w:left w:type="dxa" w:w="120"/>
+              <w:bottom w:type="dxa" w:w="80"/>
+              <w:right w:type="dxa" w:w="120"/>
+            </w:tcMar>
+          </w:tcPr>
+          <w:p>
+            <w:r>
+              <w:rPr>
+                <w:rFonts w:ascii="Arial" w:cs="Arial" w:eastAsia="Arial" w:hAnsi="Arial"/>
+                <w:b w:val="false"/>
+                <w:bCs w:val="false"/>
+                <w:color w:val="1A1A1A"/>
+                <w:sz w:val="19"/>
+                <w:szCs w:val="19"/>
+              </w:rPr>
+              <w:t xml:space="preserve">Emailurile de autentificare pleacă din regiunea UE (Irlanda).</w:t>
+            </w:r>
+          </w:p>
+        </w:tc>
+      </w:tr>
+      <w:tr>
+        <w:tc>
+          <w:tcPr>
+            <w:tcW w:type="dxa" w:w="1900"/>
+            <w:tcBorders>
+              <w:top w:val="single" w:color="C9D3DE" w:sz="4"/>
+              <w:left w:val="single" w:color="C9D3DE" w:sz="4"/>
+              <w:bottom w:val="single" w:color="C9D3DE" w:sz="4"/>
+              <w:right w:val="single" w:color="C9D3DE" w:sz="4"/>
+            </w:tcBorders>
+            <w:shd w:fill="EEF3F8" w:color="auto" w:val="clear"/>
+            <w:tcMar>
+              <w:top w:type="dxa" w:w="80"/>
+              <w:left w:type="dxa" w:w="120"/>
+              <w:bottom w:type="dxa" w:w="80"/>
+              <w:right w:type="dxa" w:w="120"/>
+            </w:tcMar>
+          </w:tcPr>
+          <w:p>
+            <w:r>
+              <w:rPr>
+                <w:rFonts w:ascii="Arial" w:cs="Arial" w:eastAsia="Arial" w:hAnsi="Arial"/>
+                <w:b/>
+                <w:bCs/>
+                <w:color w:val="1A1A1A"/>
+                <w:sz w:val="19"/>
+                <w:szCs w:val="19"/>
+              </w:rPr>
+              <w:t xml:space="preserve">Twilio</w:t>
+            </w:r>
+          </w:p>
+        </w:tc>
+        <w:tc>
+          <w:tcPr>
+            <w:tcW w:type="dxa" w:w="3000"/>
+            <w:tcBorders>
+              <w:top w:val="single" w:color="C9D3DE" w:sz="4"/>
+              <w:left w:val="single" w:color="C9D3DE" w:sz="4"/>
+              <w:bottom w:val="single" w:color="C9D3DE" w:sz="4"/>
+              <w:right w:val="single" w:color="C9D3DE" w:sz="4"/>
+            </w:tcBorders>
+            <w:shd w:fill="EEF3F8" w:color="auto" w:val="clear"/>
+            <w:tcMar>
+              <w:top w:type="dxa" w:w="80"/>
+              <w:left w:type="dxa" w:w="120"/>
+              <w:bottom w:type="dxa" w:w="80"/>
+              <w:right w:type="dxa" w:w="120"/>
+            </w:tcMar>
+          </w:tcPr>
+          <w:p>
+            <w:r>
+              <w:rPr>
+                <w:rFonts w:ascii="Arial" w:cs="Arial" w:eastAsia="Arial" w:hAnsi="Arial"/>
+                <w:b w:val="false"/>
+                <w:bCs w:val="false"/>
+                <w:color w:val="1A1A1A"/>
+                <w:sz w:val="19"/>
+                <w:szCs w:val="19"/>
+              </w:rPr>
+              <w:t xml:space="preserve">Apeluri telefonice din browser, din CRM (opțional)</w:t>
+            </w:r>
+          </w:p>
+        </w:tc>
+        <w:tc>
+          <w:tcPr>
+            <w:tcW w:type="dxa" w:w="4738"/>
+            <w:tcBorders>
+              <w:top w:val="single" w:color="C9D3DE" w:sz="4"/>
+              <w:left w:val="single" w:color="C9D3DE" w:sz="4"/>
+              <w:bottom w:val="single" w:color="C9D3DE" w:sz="4"/>
+              <w:right w:val="single" w:color="C9D3DE" w:sz="4"/>
+            </w:tcBorders>
+            <w:shd w:fill="EEF3F8" w:color="auto" w:val="clear"/>
+            <w:tcMar>
+              <w:top w:type="dxa" w:w="80"/>
+              <w:left w:type="dxa" w:w="120"/>
+              <w:bottom w:type="dxa" w:w="80"/>
+              <w:right w:type="dxa" w:w="120"/>
+            </w:tcMar>
+          </w:tcPr>
+          <w:p>
+            <w:r>
+              <w:rPr>
+                <w:rFonts w:ascii="Arial" w:cs="Arial" w:eastAsia="Arial" w:hAnsi="Arial"/>
+                <w:b w:val="false"/>
+                <w:bCs w:val="false"/>
+                <w:color w:val="1A1A1A"/>
+                <w:sz w:val="19"/>
+                <w:szCs w:val="19"/>
+              </w:rPr>
+              <w:t xml:space="preserve">Destinațiile sunt limitate la România, pentru protecția contului.</w:t>
+            </w:r>
+          </w:p>
+        </w:tc>
+      </w:tr>
+      <w:tr>
+        <w:tc>
+          <w:tcPr>
+            <w:tcW w:type="dxa" w:w="1900"/>
+            <w:tcBorders>
+              <w:top w:val="single" w:color="C9D3DE" w:sz="4"/>
+              <w:left w:val="single" w:color="C9D3DE" w:sz="4"/>
+              <w:bottom w:val="single" w:color="C9D3DE" w:sz="4"/>
+              <w:right w:val="single" w:color="C9D3DE" w:sz="4"/>
+            </w:tcBorders>
+            <w:shd w:fill="FFFFFF" w:color="auto" w:val="clear"/>
+            <w:tcMar>
+              <w:top w:type="dxa" w:w="80"/>
+              <w:left w:type="dxa" w:w="120"/>
+              <w:bottom w:type="dxa" w:w="80"/>
+              <w:right w:type="dxa" w:w="120"/>
+            </w:tcMar>
+          </w:tcPr>
+          <w:p>
+            <w:r>
+              <w:rPr>
+                <w:rFonts w:ascii="Arial" w:cs="Arial" w:eastAsia="Arial" w:hAnsi="Arial"/>
+                <w:b/>
+                <w:bCs/>
+                <w:color w:val="1A1A1A"/>
+                <w:sz w:val="19"/>
+                <w:szCs w:val="19"/>
+              </w:rPr>
+              <w:t xml:space="preserve">BoldSign</w:t>
+            </w:r>
+          </w:p>
+        </w:tc>
+        <w:tc>
+          <w:tcPr>
+            <w:tcW w:type="dxa" w:w="3000"/>
+            <w:tcBorders>
+              <w:top w:val="single" w:color="C9D3DE" w:sz="4"/>
+              <w:left w:val="single" w:color="C9D3DE" w:sz="4"/>
+              <w:bottom w:val="single" w:color="C9D3DE" w:sz="4"/>
+              <w:right w:val="single" w:color="C9D3DE" w:sz="4"/>
+            </w:tcBorders>
+            <w:shd w:fill="FFFFFF" w:color="auto" w:val="clear"/>
+            <w:tcMar>
+              <w:top w:type="dxa" w:w="80"/>
+              <w:left w:type="dxa" w:w="120"/>
+              <w:bottom w:type="dxa" w:w="80"/>
+              <w:right w:type="dxa" w:w="120"/>
+            </w:tcMar>
+          </w:tcPr>
+          <w:p>
+            <w:r>
+              <w:rPr>
+                <w:rFonts w:ascii="Arial" w:cs="Arial" w:eastAsia="Arial" w:hAnsi="Arial"/>
+                <w:b w:val="false"/>
+                <w:bCs w:val="false"/>
+                <w:color w:val="1A1A1A"/>
+                <w:sz w:val="19"/>
+                <w:szCs w:val="19"/>
+              </w:rPr>
+              <w:t xml:space="preserve">Semnătură digitală a contractelor (opțional)</w:t>
+            </w:r>
+          </w:p>
+        </w:tc>
+        <w:tc>
+          <w:tcPr>
+            <w:tcW w:type="dxa" w:w="4738"/>
+            <w:tcBorders>
+              <w:top w:val="single" w:color="C9D3DE" w:sz="4"/>
+              <w:left w:val="single" w:color="C9D3DE" w:sz="4"/>
+              <w:bottom w:val="single" w:color="C9D3DE" w:sz="4"/>
+              <w:right w:val="single" w:color="C9D3DE" w:sz="4"/>
+            </w:tcBorders>
+            <w:shd w:fill="FFFFFF" w:color="auto" w:val="clear"/>
+            <w:tcMar>
+              <w:top w:type="dxa" w:w="80"/>
+              <w:left w:type="dxa" w:w="120"/>
+              <w:bottom w:type="dxa" w:w="80"/>
+              <w:right w:type="dxa" w:w="120"/>
+            </w:tcMar>
+          </w:tcPr>
+          <w:p>
+            <w:r>
+              <w:rPr>
+                <w:rFonts w:ascii="Arial" w:cs="Arial" w:eastAsia="Arial" w:hAnsi="Arial"/>
+                <w:b w:val="false"/>
+                <w:bCs w:val="false"/>
+                <w:color w:val="1A1A1A"/>
+                <w:sz w:val="19"/>
+                <w:szCs w:val="19"/>
+              </w:rPr>
+              <w:t xml:space="preserve">Folosit doar pentru documentele trimise la semnat.</w:t>
+            </w:r>
+          </w:p>
+        </w:tc>
+      </w:tr>
+      <w:tr>
+        <w:tc>
+          <w:tcPr>
+            <w:tcW w:type="dxa" w:w="1900"/>
+            <w:tcBorders>
+              <w:top w:val="single" w:color="C9D3DE" w:sz="4"/>
+              <w:left w:val="single" w:color="C9D3DE" w:sz="4"/>
+              <w:bottom w:val="single" w:color="C9D3DE" w:sz="4"/>
+              <w:right w:val="single" w:color="C9D3DE" w:sz="4"/>
+            </w:tcBorders>
+            <w:shd w:fill="EEF3F8" w:color="auto" w:val="clear"/>
+            <w:tcMar>
+              <w:top w:type="dxa" w:w="80"/>
+              <w:left w:type="dxa" w:w="120"/>
+              <w:bottom w:type="dxa" w:w="80"/>
+              <w:right w:type="dxa" w:w="120"/>
+            </w:tcMar>
+          </w:tcPr>
+          <w:p>
+            <w:r>
+              <w:rPr>
+                <w:rFonts w:ascii="Arial" w:cs="Arial" w:eastAsia="Arial" w:hAnsi="Arial"/>
+                <w:b/>
+                <w:bCs/>
+                <w:color w:val="1A1A1A"/>
+                <w:sz w:val="19"/>
+                <w:szCs w:val="19"/>
+              </w:rPr>
+              <w:t xml:space="preserve">Canva</w:t>
+            </w:r>
+          </w:p>
+        </w:tc>
+        <w:tc>
+          <w:tcPr>
+            <w:tcW w:type="dxa" w:w="3000"/>
+            <w:tcBorders>
+              <w:top w:val="single" w:color="C9D3DE" w:sz="4"/>
+              <w:left w:val="single" w:color="C9D3DE" w:sz="4"/>
+              <w:bottom w:val="single" w:color="C9D3DE" w:sz="4"/>
+              <w:right w:val="single" w:color="C9D3DE" w:sz="4"/>
+            </w:tcBorders>
+            <w:shd w:fill="EEF3F8" w:color="auto" w:val="clear"/>
+            <w:tcMar>
+              <w:top w:type="dxa" w:w="80"/>
+              <w:left w:type="dxa" w:w="120"/>
+              <w:bottom w:type="dxa" w:w="80"/>
+              <w:right w:type="dxa" w:w="120"/>
+            </w:tcMar>
+          </w:tcPr>
+          <w:p>
+            <w:r>
+              <w:rPr>
+                <w:rFonts w:ascii="Arial" w:cs="Arial" w:eastAsia="Arial" w:hAnsi="Arial"/>
+                <w:b w:val="false"/>
+                <w:bCs w:val="false"/>
+                <w:color w:val="1A1A1A"/>
+                <w:sz w:val="19"/>
+                <w:szCs w:val="19"/>
+              </w:rPr>
+              <w:t xml:space="preserve">Design pentru rapoarte (opțional)</w:t>
+            </w:r>
+          </w:p>
+        </w:tc>
+        <w:tc>
+          <w:tcPr>
+            <w:tcW w:type="dxa" w:w="4738"/>
+            <w:tcBorders>
+              <w:top w:val="single" w:color="C9D3DE" w:sz="4"/>
+              <w:left w:val="single" w:color="C9D3DE" w:sz="4"/>
+              <w:bottom w:val="single" w:color="C9D3DE" w:sz="4"/>
+              <w:right w:val="single" w:color="C9D3DE" w:sz="4"/>
+            </w:tcBorders>
+            <w:shd w:fill="EEF3F8" w:color="auto" w:val="clear"/>
+            <w:tcMar>
+              <w:top w:type="dxa" w:w="80"/>
+              <w:left w:type="dxa" w:w="120"/>
+              <w:bottom w:type="dxa" w:w="80"/>
+              <w:right w:type="dxa" w:w="120"/>
+            </w:tcMar>
+          </w:tcPr>
+          <w:p>
+            <w:r>
+              <w:rPr>
+                <w:rFonts w:ascii="Arial" w:cs="Arial" w:eastAsia="Arial" w:hAnsi="Arial"/>
+                <w:b w:val="false"/>
+                <w:bCs w:val="false"/>
+                <w:color w:val="1A1A1A"/>
+                <w:sz w:val="19"/>
+                <w:szCs w:val="19"/>
+              </w:rPr>
+              <w:t xml:space="preserve">Conectare cu contul Canva al ONG-ului, prin autorizare OAuth.</w:t>
+            </w:r>
+          </w:p>
+        </w:tc>
+      </w:tr>
+      <w:tr>
+        <w:tc>
+          <w:tcPr>
+            <w:tcW w:type="dxa" w:w="1900"/>
+            <w:tcBorders>
+              <w:top w:val="single" w:color="C9D3DE" w:sz="4"/>
+              <w:left w:val="single" w:color="C9D3DE" w:sz="4"/>
+              <w:bottom w:val="single" w:color="C9D3DE" w:sz="4"/>
+              <w:right w:val="single" w:color="C9D3DE" w:sz="4"/>
+            </w:tcBorders>
+            <w:shd w:fill="FFFFFF" w:color="auto" w:val="clear"/>
+            <w:tcMar>
+              <w:top w:type="dxa" w:w="80"/>
+              <w:left w:type="dxa" w:w="120"/>
+              <w:bottom w:type="dxa" w:w="80"/>
+              <w:right w:type="dxa" w:w="120"/>
+            </w:tcMar>
+          </w:tcPr>
+          <w:p>
+            <w:r>
+              <w:rPr>
+                <w:rFonts w:ascii="Arial" w:cs="Arial" w:eastAsia="Arial" w:hAnsi="Arial"/>
+                <w:b/>
+                <w:bCs/>
+                <w:color w:val="1A1A1A"/>
+                <w:sz w:val="19"/>
+                <w:szCs w:val="19"/>
+              </w:rPr>
+              <w:t xml:space="preserve">Anthropic (Claude)</w:t>
+            </w:r>
+          </w:p>
+        </w:tc>
+        <w:tc>
+          <w:tcPr>
+            <w:tcW w:type="dxa" w:w="3000"/>
+            <w:tcBorders>
+              <w:top w:val="single" w:color="C9D3DE" w:sz="4"/>
+              <w:left w:val="single" w:color="C9D3DE" w:sz="4"/>
+              <w:bottom w:val="single" w:color="C9D3DE" w:sz="4"/>
+              <w:right w:val="single" w:color="C9D3DE" w:sz="4"/>
+            </w:tcBorders>
+            <w:shd w:fill="FFFFFF" w:color="auto" w:val="clear"/>
+            <w:tcMar>
+              <w:top w:type="dxa" w:w="80"/>
+              <w:left w:type="dxa" w:w="120"/>
+              <w:bottom w:type="dxa" w:w="80"/>
+              <w:right w:type="dxa" w:w="120"/>
+            </w:tcMar>
+          </w:tcPr>
+          <w:p>
+            <w:r>
+              <w:rPr>
+                <w:rFonts w:ascii="Arial" w:cs="Arial" w:eastAsia="Arial" w:hAnsi="Arial"/>
+                <w:b w:val="false"/>
+                <w:bCs w:val="false"/>
+                <w:color w:val="1A1A1A"/>
+                <w:sz w:val="19"/>
+                <w:szCs w:val="19"/>
+              </w:rPr>
+              <w:t xml:space="preserve">Generare de conținut, extragere din documente financiare, rapoarte</w:t>
+            </w:r>
+          </w:p>
+        </w:tc>
+        <w:tc>
+          <w:tcPr>
+            <w:tcW w:type="dxa" w:w="4738"/>
+            <w:tcBorders>
+              <w:top w:val="single" w:color="C9D3DE" w:sz="4"/>
+              <w:left w:val="single" w:color="C9D3DE" w:sz="4"/>
+              <w:bottom w:val="single" w:color="C9D3DE" w:sz="4"/>
+              <w:right w:val="single" w:color="C9D3DE" w:sz="4"/>
+            </w:tcBorders>
+            <w:shd w:fill="FFFFFF" w:color="auto" w:val="clear"/>
+            <w:tcMar>
+              <w:top w:type="dxa" w:w="80"/>
+              <w:left w:type="dxa" w:w="120"/>
+              <w:bottom w:type="dxa" w:w="80"/>
+              <w:right w:type="dxa" w:w="120"/>
+            </w:tcMar>
+          </w:tcPr>
+          <w:p>
+            <w:r>
+              <w:rPr>
+                <w:rFonts w:ascii="Arial" w:cs="Arial" w:eastAsia="Arial" w:hAnsi="Arial"/>
+                <w:b w:val="false"/>
+                <w:bCs w:val="false"/>
+                <w:color w:val="1A1A1A"/>
+                <w:sz w:val="19"/>
+                <w:szCs w:val="19"/>
+              </w:rPr>
+              <w:t xml:space="preserve">Datele trimise prin API nu sunt folosite la antrenarea modelelor. Utilizarea este limitată zilnic pe organizație.</w:t>
+            </w:r>
+          </w:p>
+        </w:tc>
+      </w:tr>
+      <w:tr>
+        <w:tc>
+          <w:tcPr>
+            <w:tcW w:type="dxa" w:w="1900"/>
+            <w:tcBorders>
+              <w:top w:val="single" w:color="C9D3DE" w:sz="4"/>
+              <w:left w:val="single" w:color="C9D3DE" w:sz="4"/>
+              <w:bottom w:val="single" w:color="C9D3DE" w:sz="4"/>
+              <w:right w:val="single" w:color="C9D3DE" w:sz="4"/>
+            </w:tcBorders>
+            <w:shd w:fill="EEF3F8" w:color="auto" w:val="clear"/>
+            <w:tcMar>
+              <w:top w:type="dxa" w:w="80"/>
+              <w:left w:type="dxa" w:w="120"/>
+              <w:bottom w:type="dxa" w:w="80"/>
+              <w:right w:type="dxa" w:w="120"/>
+            </w:tcMar>
+          </w:tcPr>
+          <w:p>
+            <w:r>
+              <w:rPr>
+                <w:rFonts w:ascii="Arial" w:cs="Arial" w:eastAsia="Arial" w:hAnsi="Arial"/>
+                <w:b/>
+                <w:bCs/>
+                <w:color w:val="1A1A1A"/>
+                <w:sz w:val="19"/>
+                <w:szCs w:val="19"/>
+              </w:rPr>
+              <w:t xml:space="preserve">Sentry</w:t>
+            </w:r>
+          </w:p>
+        </w:tc>
+        <w:tc>
+          <w:tcPr>
+            <w:tcW w:type="dxa" w:w="3000"/>
+            <w:tcBorders>
+              <w:top w:val="single" w:color="C9D3DE" w:sz="4"/>
+              <w:left w:val="single" w:color="C9D3DE" w:sz="4"/>
+              <w:bottom w:val="single" w:color="C9D3DE" w:sz="4"/>
+              <w:right w:val="single" w:color="C9D3DE" w:sz="4"/>
+            </w:tcBorders>
+            <w:shd w:fill="EEF3F8" w:color="auto" w:val="clear"/>
+            <w:tcMar>
+              <w:top w:type="dxa" w:w="80"/>
+              <w:left w:type="dxa" w:w="120"/>
+              <w:bottom w:type="dxa" w:w="80"/>
+              <w:right w:type="dxa" w:w="120"/>
+            </w:tcMar>
+          </w:tcPr>
+          <w:p>
+            <w:r>
+              <w:rPr>
+                <w:rFonts w:ascii="Arial" w:cs="Arial" w:eastAsia="Arial" w:hAnsi="Arial"/>
+                <w:b w:val="false"/>
+                <w:bCs w:val="false"/>
+                <w:color w:val="1A1A1A"/>
+                <w:sz w:val="19"/>
+                <w:szCs w:val="19"/>
+              </w:rPr>
+              <w:t xml:space="preserve">Monitorizarea erorilor aplicației</w:t>
+            </w:r>
+          </w:p>
+        </w:tc>
+        <w:tc>
+          <w:tcPr>
+            <w:tcW w:type="dxa" w:w="4738"/>
+            <w:tcBorders>
+              <w:top w:val="single" w:color="C9D3DE" w:sz="4"/>
+              <w:left w:val="single" w:color="C9D3DE" w:sz="4"/>
+              <w:bottom w:val="single" w:color="C9D3DE" w:sz="4"/>
+              <w:right w:val="single" w:color="C9D3DE" w:sz="4"/>
+            </w:tcBorders>
+            <w:shd w:fill="EEF3F8" w:color="auto" w:val="clear"/>
+            <w:tcMar>
+              <w:top w:type="dxa" w:w="80"/>
+              <w:left w:type="dxa" w:w="120"/>
+              <w:bottom w:type="dxa" w:w="80"/>
+              <w:right w:type="dxa" w:w="120"/>
+            </w:tcMar>
+          </w:tcPr>
+          <w:p>
+            <w:r>
+              <w:rPr>
+                <w:rFonts w:ascii="Arial" w:cs="Arial" w:eastAsia="Arial" w:hAnsi="Arial"/>
+                <w:b w:val="false"/>
+                <w:bCs w:val="false"/>
+                <w:color w:val="1A1A1A"/>
+                <w:sz w:val="19"/>
+                <w:szCs w:val="19"/>
+              </w:rPr>
+              <w:t xml:space="preserve">Proiect pe regiunea UE. Date personale eliminate din adrese înainte de trimitere.</w:t>
+            </w:r>
+          </w:p>
+        </w:tc>
+      </w:tr>
+      <w:tr>
+        <w:tc>
+          <w:tcPr>
+            <w:tcW w:type="dxa" w:w="1900"/>
+            <w:tcBorders>
+              <w:top w:val="single" w:color="C9D3DE" w:sz="4"/>
+              <w:left w:val="single" w:color="C9D3DE" w:sz="4"/>
+              <w:bottom w:val="single" w:color="C9D3DE" w:sz="4"/>
+              <w:right w:val="single" w:color="C9D3DE" w:sz="4"/>
+            </w:tcBorders>
+            <w:shd w:fill="FFFFFF" w:color="auto" w:val="clear"/>
+            <w:tcMar>
+              <w:top w:type="dxa" w:w="80"/>
+              <w:left w:type="dxa" w:w="120"/>
+              <w:bottom w:type="dxa" w:w="80"/>
+              <w:right w:type="dxa" w:w="120"/>
+            </w:tcMar>
+          </w:tcPr>
+          <w:p>
+            <w:r>
+              <w:rPr>
+                <w:rFonts w:ascii="Arial" w:cs="Arial" w:eastAsia="Arial" w:hAnsi="Arial"/>
+                <w:b/>
+                <w:bCs/>
+                <w:color w:val="1A1A1A"/>
+                <w:sz w:val="19"/>
+                <w:szCs w:val="19"/>
+              </w:rPr>
+              <w:t xml:space="preserve">Google Analytics 4</w:t>
+            </w:r>
+          </w:p>
+        </w:tc>
+        <w:tc>
+          <w:tcPr>
+            <w:tcW w:type="dxa" w:w="3000"/>
+            <w:tcBorders>
+              <w:top w:val="single" w:color="C9D3DE" w:sz="4"/>
+              <w:left w:val="single" w:color="C9D3DE" w:sz="4"/>
+              <w:bottom w:val="single" w:color="C9D3DE" w:sz="4"/>
+              <w:right w:val="single" w:color="C9D3DE" w:sz="4"/>
+            </w:tcBorders>
+            <w:shd w:fill="FFFFFF" w:color="auto" w:val="clear"/>
+            <w:tcMar>
+              <w:top w:type="dxa" w:w="80"/>
+              <w:left w:type="dxa" w:w="120"/>
+              <w:bottom w:type="dxa" w:w="80"/>
+              <w:right w:type="dxa" w:w="120"/>
+            </w:tcMar>
+          </w:tcPr>
+          <w:p>
+            <w:r>
+              <w:rPr>
+                <w:rFonts w:ascii="Arial" w:cs="Arial" w:eastAsia="Arial" w:hAnsi="Arial"/>
+                <w:b w:val="false"/>
+                <w:bCs w:val="false"/>
+                <w:color w:val="1A1A1A"/>
+                <w:sz w:val="19"/>
+                <w:szCs w:val="19"/>
+              </w:rPr>
+              <w:t xml:space="preserve">Statistici de vizitare a paginilor publice</w:t>
+            </w:r>
+          </w:p>
+        </w:tc>
+        <w:tc>
+          <w:tcPr>
+            <w:tcW w:type="dxa" w:w="4738"/>
+            <w:tcBorders>
+              <w:top w:val="single" w:color="C9D3DE" w:sz="4"/>
+              <w:left w:val="single" w:color="C9D3DE" w:sz="4"/>
+              <w:bottom w:val="single" w:color="C9D3DE" w:sz="4"/>
+              <w:right w:val="single" w:color="C9D3DE" w:sz="4"/>
+            </w:tcBorders>
+            <w:shd w:fill="FFFFFF" w:color="auto" w:val="clear"/>
+            <w:tcMar>
+              <w:top w:type="dxa" w:w="80"/>
+              <w:left w:type="dxa" w:w="120"/>
+              <w:bottom w:type="dxa" w:w="80"/>
+              <w:right w:type="dxa" w:w="120"/>
+            </w:tcMar>
+          </w:tcPr>
+          <w:p>
+            <w:r>
+              <w:rPr>
+                <w:rFonts w:ascii="Arial" w:cs="Arial" w:eastAsia="Arial" w:hAnsi="Arial"/>
+                <w:b w:val="false"/>
+                <w:bCs w:val="false"/>
+                <w:color w:val="1A1A1A"/>
+                <w:sz w:val="19"/>
+                <w:szCs w:val="19"/>
+              </w:rPr>
+              <w:t xml:space="preserve">Pornește doar după acordul vizitatorului. Exclus de pe paginile cu date personale.</w:t>
+            </w:r>
+          </w:p>
+        </w:tc>
+      </w:tr>
+      <w:tr>
+        <w:tc>
+          <w:tcPr>
+            <w:tcW w:type="dxa" w:w="1900"/>
+            <w:tcBorders>
+              <w:top w:val="single" w:color="C9D3DE" w:sz="4"/>
+              <w:left w:val="single" w:color="C9D3DE" w:sz="4"/>
+              <w:bottom w:val="single" w:color="C9D3DE" w:sz="4"/>
+              <w:right w:val="single" w:color="C9D3DE" w:sz="4"/>
+            </w:tcBorders>
+            <w:shd w:fill="EEF3F8" w:color="auto" w:val="clear"/>
+            <w:tcMar>
+              <w:top w:type="dxa" w:w="80"/>
+              <w:left w:type="dxa" w:w="120"/>
+              <w:bottom w:type="dxa" w:w="80"/>
+              <w:right w:type="dxa" w:w="120"/>
+            </w:tcMar>
+          </w:tcPr>
+          <w:p>
+            <w:r>
+              <w:rPr>
+                <w:rFonts w:ascii="Arial" w:cs="Arial" w:eastAsia="Arial" w:hAnsi="Arial"/>
+                <w:b/>
+                <w:bCs/>
+                <w:color w:val="1A1A1A"/>
+                <w:sz w:val="19"/>
+                <w:szCs w:val="19"/>
+              </w:rPr>
+              <w:t xml:space="preserve">Calendly</w:t>
+            </w:r>
+          </w:p>
+        </w:tc>
+        <w:tc>
+          <w:tcPr>
+            <w:tcW w:type="dxa" w:w="3000"/>
+            <w:tcBorders>
+              <w:top w:val="single" w:color="C9D3DE" w:sz="4"/>
+              <w:left w:val="single" w:color="C9D3DE" w:sz="4"/>
+              <w:bottom w:val="single" w:color="C9D3DE" w:sz="4"/>
+              <w:right w:val="single" w:color="C9D3DE" w:sz="4"/>
+            </w:tcBorders>
+            <w:shd w:fill="EEF3F8" w:color="auto" w:val="clear"/>
+            <w:tcMar>
+              <w:top w:type="dxa" w:w="80"/>
+              <w:left w:type="dxa" w:w="120"/>
+              <w:bottom w:type="dxa" w:w="80"/>
+              <w:right w:type="dxa" w:w="120"/>
+            </w:tcMar>
+          </w:tcPr>
+          <w:p>
+            <w:r>
+              <w:rPr>
+                <w:rFonts w:ascii="Arial" w:cs="Arial" w:eastAsia="Arial" w:hAnsi="Arial"/>
+                <w:b w:val="false"/>
+                <w:bCs w:val="false"/>
+                <w:color w:val="1A1A1A"/>
+                <w:sz w:val="19"/>
+                <w:szCs w:val="19"/>
+              </w:rPr>
+              <w:t xml:space="preserve">Programarea sesiunilor de consultanță</w:t>
+            </w:r>
+          </w:p>
+        </w:tc>
+        <w:tc>
+          <w:tcPr>
+            <w:tcW w:type="dxa" w:w="4738"/>
+            <w:tcBorders>
+              <w:top w:val="single" w:color="C9D3DE" w:sz="4"/>
+              <w:left w:val="single" w:color="C9D3DE" w:sz="4"/>
+              <w:bottom w:val="single" w:color="C9D3DE" w:sz="4"/>
+              <w:right w:val="single" w:color="C9D3DE" w:sz="4"/>
+            </w:tcBorders>
+            <w:shd w:fill="EEF3F8" w:color="auto" w:val="clear"/>
+            <w:tcMar>
+              <w:top w:type="dxa" w:w="80"/>
+              <w:left w:type="dxa" w:w="120"/>
+              <w:bottom w:type="dxa" w:w="80"/>
+              <w:right w:type="dxa" w:w="120"/>
+            </w:tcMar>
+          </w:tcPr>
+          <w:p>
+            <w:r>
+              <w:rPr>
+                <w:rFonts w:ascii="Arial" w:cs="Arial" w:eastAsia="Arial" w:hAnsi="Arial"/>
+                <w:b w:val="false"/>
+                <w:bCs w:val="false"/>
+                <w:color w:val="1A1A1A"/>
+                <w:sz w:val="19"/>
+                <w:szCs w:val="19"/>
+              </w:rPr>
+              <w:t xml:space="preserve">Afișat doar pe pagina de consultanță.</w:t>
             </w:r>
           </w:p>
         </w:tc>
@@ -1031,6 +2891,22 @@
     </w:tbl>
     <w:p>
       <w:pPr>
+        <w:spacing w:after="120" w:line="300"/>
+      </w:pPr>
+      <w:r>
+        <w:rPr>
+          <w:rFonts w:ascii="Arial" w:cs="Arial" w:eastAsia="Arial" w:hAnsi="Arial"/>
+          <w:i/>
+          <w:iCs/>
+          <w:color w:val="5A6470"/>
+          <w:sz w:val="19"/>
+          <w:szCs w:val="19"/>
+        </w:rPr>
+        <w:t xml:space="preserve">Toți furnizorii sunt menționați în Politica de confidențialitate și în acordul de prelucrare a datelor (DPA) al platformei.</w:t>
+      </w:r>
+    </w:p>
+    <w:p>
+      <w:pPr>
         <w:pStyle w:val="Heading1"/>
         <w:spacing w:after="160" w:before="360"/>
       </w:pPr>
@@ -1038,7 +2914,7 @@
         <w:rPr>
           <w:rFonts w:ascii="Arial" w:cs="Arial" w:eastAsia="Arial" w:hAnsi="Arial"/>
         </w:rPr>
-        <w:t xml:space="preserve">3. Cât de securizați sunt furnizorii actuali</w:t>
+        <w:t xml:space="preserve">4. Cât de securizați sunt furnizorii principali</w:t>
       </w:r>
     </w:p>
     <w:p>
@@ -1343,6 +3219,22 @@
     </w:p>
     <w:p>
       <w:pPr>
+        <w:spacing w:after="120" w:line="300"/>
+      </w:pPr>
+      <w:r>
+        <w:rPr>
+          <w:rFonts w:ascii="Arial" w:cs="Arial" w:eastAsia="Arial" w:hAnsi="Arial"/>
+          <w:i/>
+          <w:iCs/>
+          <w:color w:val="5A6470"/>
+          <w:sz w:val="17"/>
+          <w:szCs w:val="17"/>
+        </w:rPr>
+        <w:t xml:space="preserve">Surse: vercel.com/docs/security/compliance; vercel.com/legal/dpa; supabase.com/security. Pentru verificarea formală, rapoartele de audit SOC 2 se obțin direct de la furnizori.</w:t>
+      </w:r>
+    </w:p>
+    <w:p>
+      <w:pPr>
         <w:pStyle w:val="Heading1"/>
         <w:spacing w:after="160" w:before="360"/>
       </w:pPr>
@@ -1350,7 +3242,7 @@
         <w:rPr>
           <w:rFonts w:ascii="Arial" w:cs="Arial" w:eastAsia="Arial" w:hAnsi="Arial"/>
         </w:rPr>
-        <w:t xml:space="preserve">4. Măsuri de securitate în aplicație</w:t>
+        <w:t xml:space="preserve">5. Măsuri de securitate în aplicație</w:t>
       </w:r>
     </w:p>
     <w:p>
@@ -1565,7 +3457,7 @@
         <w:rPr>
           <w:rFonts w:ascii="Arial" w:cs="Arial" w:eastAsia="Arial" w:hAnsi="Arial"/>
         </w:rPr>
-        <w:t xml:space="preserve">5. Comparație: cloud actual vs. server intern</w:t>
+        <w:t xml:space="preserve">6. Comparație: cloud actual vs. server intern</w:t>
       </w:r>
     </w:p>
     <w:tbl>
@@ -2643,7 +4535,7 @@
         <w:rPr>
           <w:rFonts w:ascii="Arial" w:cs="Arial" w:eastAsia="Arial" w:hAnsi="Arial"/>
         </w:rPr>
-        <w:t xml:space="preserve">6. Avantaje și dezavantaje</w:t>
+        <w:t xml:space="preserve">7. Avantaje și dezavantaje</w:t>
       </w:r>
     </w:p>
     <w:p>
@@ -3047,6 +4939,11 @@
       </w:r>
     </w:p>
     <w:p>
+      <w:r>
+        <w:br w:type="page"/>
+      </w:r>
+    </w:p>
+    <w:p>
       <w:pPr>
         <w:pStyle w:val="Heading1"/>
         <w:spacing w:after="160" w:before="360"/>
@@ -3055,7 +4952,7 @@
         <w:rPr>
           <w:rFonts w:ascii="Arial" w:cs="Arial" w:eastAsia="Arial" w:hAnsi="Arial"/>
         </w:rPr>
-        <w:t xml:space="preserve">7. Propunere de compromis</w:t>
+        <w:t xml:space="preserve">8. Propunere de compromis</w:t>
       </w:r>
     </w:p>
     <w:p>
@@ -3232,27 +5129,6 @@
         </w:tc>
       </w:tr>
     </w:tbl>
-    <w:p>
-      <w:pPr>
-        <w:spacing w:after="120"/>
-      </w:pPr>
-    </w:p>
-    <w:p>
-      <w:pPr>
-        <w:spacing w:after="120" w:line="300"/>
-      </w:pPr>
-      <w:r>
-        <w:rPr>
-          <w:rFonts w:ascii="Arial" w:cs="Arial" w:eastAsia="Arial" w:hAnsi="Arial"/>
-          <w:i/>
-          <w:iCs/>
-          <w:color w:val="5A6470"/>
-          <w:sz w:val="17"/>
-          <w:szCs w:val="17"/>
-        </w:rPr>
-        <w:t xml:space="preserve">Surse: vercel.com/docs/security/compliance; vercel.com/legal/dpa; supabase.com/security. Pentru verificarea formală, rapoartele de audit SOC 2 se obțin direct de la furnizori.</w:t>
-      </w:r>
-    </w:p>
     <w:sectPr>
       <w:headerReference w:type="default" r:id="rId7"/>
       <w:footerReference w:type="default" r:id="rId8"/>

</xml_diff>